<commit_message>
Cluster report: causes by cluster (rule flags vs discharge codes) with figure G; layout fix
Co-Authored-By: Claude Opus 5.5 <noreply@anthropic.com>
Claude-Session: https://claude.ai/code/session_01GU8fuUfGjoh8P3bGU7fPv9
</commit_message>
<xml_diff>
--- a/docs/KCD_군집분석보고서.docx
+++ b/docs/KCD_군집분석보고서.docx
@@ -135,6 +135,19 @@
         <w:spacing w:after="60" w:line="290"/>
       </w:pPr>
       <w:r>
+        <w:t xml:space="preserve">퇴원 진단 코드와 맞춰 보면 허혈성 간세포형에 저산소성 간염·심부전, 황달 동반 혼합형에 담도폐쇄·담관염, 기저 간질환형에 만성 간질환·바이러스 간염이 몰립니다. 규칙의 담도폐쇄 판정은 모든 군집에서 63-73%로 같아 구분력이 없습니다.</w:t>
+      </w:r>
+    </w:p>
+    <w:p>
+      <w:pPr>
+        <w:pStyle w:val="ListParagraph"/>
+        <w:numPr>
+          <w:ilvl w:val="0"/>
+          <w:numId w:val="2"/>
+        </w:numPr>
+        <w:spacing w:after="60" w:line="290"/>
+      </w:pPr>
+      <w:r>
         <w:t xml:space="preserve">개발 집단과 평가 집단에서 군집별 ICU 사망률과 회복률이 거의 같아 재현됩니다.</w:t>
       </w:r>
     </w:p>
@@ -852,7 +865,7 @@
       <w:r>
         <w:drawing>
           <wp:inline distT="0" distB="0" distL="0" distR="0">
-            <wp:extent cx="5038725" cy="3286125"/>
+            <wp:extent cx="5038725" cy="3219450"/>
             <wp:effectExtent t="0" r="0" b="0" l="0"/>
             <wp:docPr id="1" name="" descr="" title=""/>
             <wp:cNvGraphicFramePr>
@@ -877,7 +890,7 @@
                   <pic:spPr bwMode="auto">
                     <a:xfrm>
                       <a:off x="0" y="0"/>
-                      <a:ext cx="5038725" cy="3286125"/>
+                      <a:ext cx="5038725" cy="3219450"/>
                     </a:xfrm>
                     <a:prstGeom prst="rect">
                       <a:avLst/>
@@ -4567,7 +4580,7 @@
       <w:r>
         <w:drawing>
           <wp:inline distT="0" distB="0" distL="0" distR="0">
-            <wp:extent cx="5400675" cy="2295525"/>
+            <wp:extent cx="5400675" cy="2247900"/>
             <wp:effectExtent t="0" r="0" b="0" l="0"/>
             <wp:docPr id="1" name="" descr="" title=""/>
             <wp:cNvGraphicFramePr>
@@ -4592,7 +4605,7 @@
                   <pic:spPr bwMode="auto">
                     <a:xfrm>
                       <a:off x="0" y="0"/>
-                      <a:ext cx="5400675" cy="2295525"/>
+                      <a:ext cx="5400675" cy="2247900"/>
                     </a:xfrm>
                     <a:prstGeom prst="rect">
                       <a:avLst/>
@@ -8392,7 +8405,7 @@
       <w:r>
         <w:drawing>
           <wp:inline distT="0" distB="0" distL="0" distR="0">
-            <wp:extent cx="4324350" cy="3381375"/>
+            <wp:extent cx="4324350" cy="3590925"/>
             <wp:effectExtent t="0" r="0" b="0" l="0"/>
             <wp:docPr id="1" name="" descr="" title=""/>
             <wp:cNvGraphicFramePr>
@@ -8417,7 +8430,7 @@
                   <pic:spPr bwMode="auto">
                     <a:xfrm>
                       <a:off x="0" y="0"/>
-                      <a:ext cx="4324350" cy="3381375"/>
+                      <a:ext cx="4324350" cy="3590925"/>
                     </a:xfrm>
                     <a:prstGeom prst="rect">
                       <a:avLst/>
@@ -8451,7 +8464,7 @@
       <w:r>
         <w:drawing>
           <wp:inline distT="0" distB="0" distL="0" distR="0">
-            <wp:extent cx="4676775" cy="5181600"/>
+            <wp:extent cx="4676775" cy="4676775"/>
             <wp:effectExtent t="0" r="0" b="0" l="0"/>
             <wp:docPr id="1" name="" descr="" title=""/>
             <wp:cNvGraphicFramePr>
@@ -8476,7 +8489,7 @@
                   <pic:spPr bwMode="auto">
                     <a:xfrm>
                       <a:off x="0" y="0"/>
-                      <a:ext cx="4676775" cy="5181600"/>
+                      <a:ext cx="4676775" cy="4676775"/>
                     </a:xfrm>
                     <a:prstGeom prst="rect">
                       <a:avLst/>
@@ -8519,7 +8532,7 @@
       <w:r>
         <w:drawing>
           <wp:inline distT="0" distB="0" distL="0" distR="0">
-            <wp:extent cx="5400675" cy="2495550"/>
+            <wp:extent cx="5400675" cy="2400300"/>
             <wp:effectExtent t="0" r="0" b="0" l="0"/>
             <wp:docPr id="1" name="" descr="" title=""/>
             <wp:cNvGraphicFramePr>
@@ -8544,7 +8557,7 @@
                   <pic:spPr bwMode="auto">
                     <a:xfrm>
                       <a:off x="0" y="0"/>
-                      <a:ext cx="5400675" cy="2495550"/>
+                      <a:ext cx="5400675" cy="2400300"/>
                     </a:xfrm>
                     <a:prstGeom prst="rect">
                       <a:avLst/>
@@ -9554,7 +9567,15 @@
         <w:spacing w:after="200" w:before="360"/>
       </w:pPr>
       <w:r>
-        <w:t xml:space="preserve">6. 군집이 예후 정보를 더하는가</w:t>
+        <w:t xml:space="preserve">6. 군집별 원인 10개</w:t>
+      </w:r>
+    </w:p>
+    <w:p>
+      <w:pPr>
+        <w:spacing w:after="100" w:line="300"/>
+      </w:pPr>
+      <w:r>
+        <w:t xml:space="preserve">첫 사건마다 그 시점까지 공개된 자료로 규칙 모델(Agent 1)이 원인 10개를 각각 0/1로 판정했고, 같은 입원의 퇴원 진단 코드(ICD 대리 기준)를 함께 붙였습니다. 개발과 평가 집단을 합친 전체 사건 기준입니다.</w:t>
       </w:r>
     </w:p>
     <w:p>
@@ -9565,7 +9586,7 @@
       <w:r>
         <w:drawing>
           <wp:inline distT="0" distB="0" distL="0" distR="0">
-            <wp:extent cx="4324350" cy="3067050"/>
+            <wp:extent cx="5943600" cy="2790825"/>
             <wp:effectExtent t="0" r="0" b="0" l="0"/>
             <wp:docPr id="1" name="" descr="" title=""/>
             <wp:cNvGraphicFramePr>
@@ -9590,7 +9611,4395 @@
                   <pic:spPr bwMode="auto">
                     <a:xfrm>
                       <a:off x="0" y="0"/>
-                      <a:ext cx="4324350" cy="3067050"/>
+                      <a:ext cx="5943600" cy="2790825"/>
+                    </a:xfrm>
+                    <a:prstGeom prst="rect">
+                      <a:avLst/>
+                    </a:prstGeom>
+                  </pic:spPr>
+                </pic:pic>
+              </a:graphicData>
+            </a:graphic>
+          </wp:inline>
+        </w:drawing>
+      </w:r>
+    </w:p>
+    <w:p>
+      <w:pPr>
+        <w:spacing w:after="200"/>
+      </w:pPr>
+      <w:r>
+        <w:rPr>
+          <w:color w:val="5A6B70"/>
+          <w:sz w:val="18"/>
+          <w:szCs w:val="18"/>
+        </w:rPr>
+        <w:t xml:space="preserve">그림 G. 군집별 원인 10개 해당 비율. 왼쪽 = 규칙 판정(첫 사건 시점), 오른쪽 = 퇴원 진단 코드(시각 없음, ICU 전후 구분 불가).</w:t>
+      </w:r>
+    </w:p>
+    <w:p>
+      <w:pPr>
+        <w:pStyle w:val="Heading2"/>
+      </w:pPr>
+      <w:r>
+        <w:t xml:space="preserve">규칙 판정 (첫 사건 시점)</w:t>
+      </w:r>
+    </w:p>
+    <w:tbl>
+      <w:tblPr>
+        <w:tblW w:type="dxa" w:w="9638"/>
+        <w:tblBorders>
+          <w:top w:val="single" w:color="auto" w:sz="4"/>
+          <w:left w:val="single" w:color="auto" w:sz="4"/>
+          <w:bottom w:val="single" w:color="auto" w:sz="4"/>
+          <w:right w:val="single" w:color="auto" w:sz="4"/>
+          <w:insideH w:val="single" w:color="auto" w:sz="4"/>
+          <w:insideV w:val="single" w:color="auto" w:sz="4"/>
+        </w:tblBorders>
+      </w:tblPr>
+      <w:tblGrid>
+        <w:gridCol w:w="3126"/>
+        <w:gridCol w:w="1302"/>
+        <w:gridCol w:w="1302"/>
+        <w:gridCol w:w="1302"/>
+        <w:gridCol w:w="1302"/>
+        <w:gridCol w:w="1304"/>
+      </w:tblGrid>
+      <w:tr>
+        <w:trPr>
+          <w:tblHeader/>
+        </w:trPr>
+        <w:tc>
+          <w:tcPr>
+            <w:tcW w:type="dxa" w:w="3126"/>
+            <w:tcBorders>
+              <w:top w:val="single" w:color="B9C8C4" w:sz="4"/>
+              <w:left w:val="single" w:color="B9C8C4" w:sz="4"/>
+              <w:bottom w:val="single" w:color="B9C8C4" w:sz="4"/>
+              <w:right w:val="single" w:color="B9C8C4" w:sz="4"/>
+            </w:tcBorders>
+            <w:shd w:fill="E8F0EE" w:color="auto" w:val="clear"/>
+            <w:tcMar>
+              <w:top w:type="dxa" w:w="60"/>
+              <w:left w:type="dxa" w:w="90"/>
+              <w:bottom w:type="dxa" w:w="60"/>
+              <w:right w:type="dxa" w:w="90"/>
+            </w:tcMar>
+          </w:tcPr>
+          <w:p>
+            <w:pPr>
+              <w:spacing w:after="0" w:line="260"/>
+            </w:pPr>
+            <w:r>
+              <w:rPr>
+                <w:b/>
+                <w:bCs/>
+                <w:sz w:val="18"/>
+                <w:szCs w:val="18"/>
+              </w:rPr>
+              <w:t xml:space="preserve">원인</w:t>
+            </w:r>
+          </w:p>
+        </w:tc>
+        <w:tc>
+          <w:tcPr>
+            <w:tcW w:type="dxa" w:w="1302"/>
+            <w:tcBorders>
+              <w:top w:val="single" w:color="B9C8C4" w:sz="4"/>
+              <w:left w:val="single" w:color="B9C8C4" w:sz="4"/>
+              <w:bottom w:val="single" w:color="B9C8C4" w:sz="4"/>
+              <w:right w:val="single" w:color="B9C8C4" w:sz="4"/>
+            </w:tcBorders>
+            <w:shd w:fill="E8F0EE" w:color="auto" w:val="clear"/>
+            <w:tcMar>
+              <w:top w:type="dxa" w:w="60"/>
+              <w:left w:type="dxa" w:w="90"/>
+              <w:bottom w:type="dxa" w:w="60"/>
+              <w:right w:type="dxa" w:w="90"/>
+            </w:tcMar>
+          </w:tcPr>
+          <w:p>
+            <w:pPr>
+              <w:spacing w:after="0" w:line="260"/>
+            </w:pPr>
+            <w:r>
+              <w:rPr>
+                <w:b/>
+                <w:bCs/>
+                <w:sz w:val="18"/>
+                <w:szCs w:val="18"/>
+              </w:rPr>
+              <w:t xml:space="preserve">C0</w:t>
+            </w:r>
+          </w:p>
+        </w:tc>
+        <w:tc>
+          <w:tcPr>
+            <w:tcW w:type="dxa" w:w="1302"/>
+            <w:tcBorders>
+              <w:top w:val="single" w:color="B9C8C4" w:sz="4"/>
+              <w:left w:val="single" w:color="B9C8C4" w:sz="4"/>
+              <w:bottom w:val="single" w:color="B9C8C4" w:sz="4"/>
+              <w:right w:val="single" w:color="B9C8C4" w:sz="4"/>
+            </w:tcBorders>
+            <w:shd w:fill="E8F0EE" w:color="auto" w:val="clear"/>
+            <w:tcMar>
+              <w:top w:type="dxa" w:w="60"/>
+              <w:left w:type="dxa" w:w="90"/>
+              <w:bottom w:type="dxa" w:w="60"/>
+              <w:right w:type="dxa" w:w="90"/>
+            </w:tcMar>
+          </w:tcPr>
+          <w:p>
+            <w:pPr>
+              <w:spacing w:after="0" w:line="260"/>
+            </w:pPr>
+            <w:r>
+              <w:rPr>
+                <w:b/>
+                <w:bCs/>
+                <w:sz w:val="18"/>
+                <w:szCs w:val="18"/>
+              </w:rPr>
+              <w:t xml:space="preserve">C1</w:t>
+            </w:r>
+          </w:p>
+        </w:tc>
+        <w:tc>
+          <w:tcPr>
+            <w:tcW w:type="dxa" w:w="1302"/>
+            <w:tcBorders>
+              <w:top w:val="single" w:color="B9C8C4" w:sz="4"/>
+              <w:left w:val="single" w:color="B9C8C4" w:sz="4"/>
+              <w:bottom w:val="single" w:color="B9C8C4" w:sz="4"/>
+              <w:right w:val="single" w:color="B9C8C4" w:sz="4"/>
+            </w:tcBorders>
+            <w:shd w:fill="E8F0EE" w:color="auto" w:val="clear"/>
+            <w:tcMar>
+              <w:top w:type="dxa" w:w="60"/>
+              <w:left w:type="dxa" w:w="90"/>
+              <w:bottom w:type="dxa" w:w="60"/>
+              <w:right w:type="dxa" w:w="90"/>
+            </w:tcMar>
+          </w:tcPr>
+          <w:p>
+            <w:pPr>
+              <w:spacing w:after="0" w:line="260"/>
+            </w:pPr>
+            <w:r>
+              <w:rPr>
+                <w:b/>
+                <w:bCs/>
+                <w:sz w:val="18"/>
+                <w:szCs w:val="18"/>
+              </w:rPr>
+              <w:t xml:space="preserve">C2</w:t>
+            </w:r>
+          </w:p>
+        </w:tc>
+        <w:tc>
+          <w:tcPr>
+            <w:tcW w:type="dxa" w:w="1302"/>
+            <w:tcBorders>
+              <w:top w:val="single" w:color="B9C8C4" w:sz="4"/>
+              <w:left w:val="single" w:color="B9C8C4" w:sz="4"/>
+              <w:bottom w:val="single" w:color="B9C8C4" w:sz="4"/>
+              <w:right w:val="single" w:color="B9C8C4" w:sz="4"/>
+            </w:tcBorders>
+            <w:shd w:fill="E8F0EE" w:color="auto" w:val="clear"/>
+            <w:tcMar>
+              <w:top w:type="dxa" w:w="60"/>
+              <w:left w:type="dxa" w:w="90"/>
+              <w:bottom w:type="dxa" w:w="60"/>
+              <w:right w:type="dxa" w:w="90"/>
+            </w:tcMar>
+          </w:tcPr>
+          <w:p>
+            <w:pPr>
+              <w:spacing w:after="0" w:line="260"/>
+            </w:pPr>
+            <w:r>
+              <w:rPr>
+                <w:b/>
+                <w:bCs/>
+                <w:sz w:val="18"/>
+                <w:szCs w:val="18"/>
+              </w:rPr>
+              <w:t xml:space="preserve">C3</w:t>
+            </w:r>
+          </w:p>
+        </w:tc>
+        <w:tc>
+          <w:tcPr>
+            <w:tcW w:type="dxa" w:w="1304"/>
+            <w:tcBorders>
+              <w:top w:val="single" w:color="B9C8C4" w:sz="4"/>
+              <w:left w:val="single" w:color="B9C8C4" w:sz="4"/>
+              <w:bottom w:val="single" w:color="B9C8C4" w:sz="4"/>
+              <w:right w:val="single" w:color="B9C8C4" w:sz="4"/>
+            </w:tcBorders>
+            <w:shd w:fill="E8F0EE" w:color="auto" w:val="clear"/>
+            <w:tcMar>
+              <w:top w:type="dxa" w:w="60"/>
+              <w:left w:type="dxa" w:w="90"/>
+              <w:bottom w:type="dxa" w:w="60"/>
+              <w:right w:type="dxa" w:w="90"/>
+            </w:tcMar>
+          </w:tcPr>
+          <w:p>
+            <w:pPr>
+              <w:spacing w:after="0" w:line="260"/>
+            </w:pPr>
+            <w:r>
+              <w:rPr>
+                <w:b/>
+                <w:bCs/>
+                <w:sz w:val="18"/>
+                <w:szCs w:val="18"/>
+              </w:rPr>
+              <w:t xml:space="preserve">C4</w:t>
+            </w:r>
+          </w:p>
+        </w:tc>
+      </w:tr>
+      <w:tr>
+        <w:tc>
+          <w:tcPr>
+            <w:tcW w:type="dxa" w:w="3126"/>
+            <w:tcBorders>
+              <w:top w:val="single" w:color="B9C8C4" w:sz="4"/>
+              <w:left w:val="single" w:color="B9C8C4" w:sz="4"/>
+              <w:bottom w:val="single" w:color="B9C8C4" w:sz="4"/>
+              <w:right w:val="single" w:color="B9C8C4" w:sz="4"/>
+            </w:tcBorders>
+            <w:tcMar>
+              <w:top w:type="dxa" w:w="60"/>
+              <w:left w:type="dxa" w:w="90"/>
+              <w:bottom w:type="dxa" w:w="60"/>
+              <w:right w:type="dxa" w:w="90"/>
+            </w:tcMar>
+          </w:tcPr>
+          <w:p>
+            <w:pPr>
+              <w:spacing w:after="0" w:line="260"/>
+            </w:pPr>
+            <w:r>
+              <w:rPr>
+                <w:b w:val="false"/>
+                <w:bCs w:val="false"/>
+                <w:sz w:val="18"/>
+                <w:szCs w:val="18"/>
+              </w:rPr>
+              <w:t xml:space="preserve">저산소성 간염</w:t>
+            </w:r>
+          </w:p>
+        </w:tc>
+        <w:tc>
+          <w:tcPr>
+            <w:tcW w:type="dxa" w:w="1302"/>
+            <w:tcBorders>
+              <w:top w:val="single" w:color="B9C8C4" w:sz="4"/>
+              <w:left w:val="single" w:color="B9C8C4" w:sz="4"/>
+              <w:bottom w:val="single" w:color="B9C8C4" w:sz="4"/>
+              <w:right w:val="single" w:color="B9C8C4" w:sz="4"/>
+            </w:tcBorders>
+            <w:tcMar>
+              <w:top w:type="dxa" w:w="60"/>
+              <w:left w:type="dxa" w:w="90"/>
+              <w:bottom w:type="dxa" w:w="60"/>
+              <w:right w:type="dxa" w:w="90"/>
+            </w:tcMar>
+          </w:tcPr>
+          <w:p>
+            <w:pPr>
+              <w:spacing w:after="0" w:line="260"/>
+            </w:pPr>
+            <w:r>
+              <w:rPr>
+                <w:b w:val="false"/>
+                <w:bCs w:val="false"/>
+                <w:sz w:val="18"/>
+                <w:szCs w:val="18"/>
+              </w:rPr>
+              <w:t xml:space="preserve">95%</w:t>
+            </w:r>
+          </w:p>
+        </w:tc>
+        <w:tc>
+          <w:tcPr>
+            <w:tcW w:type="dxa" w:w="1302"/>
+            <w:tcBorders>
+              <w:top w:val="single" w:color="B9C8C4" w:sz="4"/>
+              <w:left w:val="single" w:color="B9C8C4" w:sz="4"/>
+              <w:bottom w:val="single" w:color="B9C8C4" w:sz="4"/>
+              <w:right w:val="single" w:color="B9C8C4" w:sz="4"/>
+            </w:tcBorders>
+            <w:tcMar>
+              <w:top w:type="dxa" w:w="60"/>
+              <w:left w:type="dxa" w:w="90"/>
+              <w:bottom w:type="dxa" w:w="60"/>
+              <w:right w:type="dxa" w:w="90"/>
+            </w:tcMar>
+          </w:tcPr>
+          <w:p>
+            <w:pPr>
+              <w:spacing w:after="0" w:line="260"/>
+            </w:pPr>
+            <w:r>
+              <w:rPr>
+                <w:b w:val="false"/>
+                <w:bCs w:val="false"/>
+                <w:sz w:val="18"/>
+                <w:szCs w:val="18"/>
+              </w:rPr>
+              <w:t xml:space="preserve">32%</w:t>
+            </w:r>
+          </w:p>
+        </w:tc>
+        <w:tc>
+          <w:tcPr>
+            <w:tcW w:type="dxa" w:w="1302"/>
+            <w:tcBorders>
+              <w:top w:val="single" w:color="B9C8C4" w:sz="4"/>
+              <w:left w:val="single" w:color="B9C8C4" w:sz="4"/>
+              <w:bottom w:val="single" w:color="B9C8C4" w:sz="4"/>
+              <w:right w:val="single" w:color="B9C8C4" w:sz="4"/>
+            </w:tcBorders>
+            <w:tcMar>
+              <w:top w:type="dxa" w:w="60"/>
+              <w:left w:type="dxa" w:w="90"/>
+              <w:bottom w:type="dxa" w:w="60"/>
+              <w:right w:type="dxa" w:w="90"/>
+            </w:tcMar>
+          </w:tcPr>
+          <w:p>
+            <w:pPr>
+              <w:spacing w:after="0" w:line="260"/>
+            </w:pPr>
+            <w:r>
+              <w:rPr>
+                <w:b w:val="false"/>
+                <w:bCs w:val="false"/>
+                <w:sz w:val="18"/>
+                <w:szCs w:val="18"/>
+              </w:rPr>
+              <w:t xml:space="preserve">4%</w:t>
+            </w:r>
+          </w:p>
+        </w:tc>
+        <w:tc>
+          <w:tcPr>
+            <w:tcW w:type="dxa" w:w="1302"/>
+            <w:tcBorders>
+              <w:top w:val="single" w:color="B9C8C4" w:sz="4"/>
+              <w:left w:val="single" w:color="B9C8C4" w:sz="4"/>
+              <w:bottom w:val="single" w:color="B9C8C4" w:sz="4"/>
+              <w:right w:val="single" w:color="B9C8C4" w:sz="4"/>
+            </w:tcBorders>
+            <w:tcMar>
+              <w:top w:type="dxa" w:w="60"/>
+              <w:left w:type="dxa" w:w="90"/>
+              <w:bottom w:type="dxa" w:w="60"/>
+              <w:right w:type="dxa" w:w="90"/>
+            </w:tcMar>
+          </w:tcPr>
+          <w:p>
+            <w:pPr>
+              <w:spacing w:after="0" w:line="260"/>
+            </w:pPr>
+            <w:r>
+              <w:rPr>
+                <w:b w:val="false"/>
+                <w:bCs w:val="false"/>
+                <w:sz w:val="18"/>
+                <w:szCs w:val="18"/>
+              </w:rPr>
+              <w:t xml:space="preserve">32%</w:t>
+            </w:r>
+          </w:p>
+        </w:tc>
+        <w:tc>
+          <w:tcPr>
+            <w:tcW w:type="dxa" w:w="1304"/>
+            <w:tcBorders>
+              <w:top w:val="single" w:color="B9C8C4" w:sz="4"/>
+              <w:left w:val="single" w:color="B9C8C4" w:sz="4"/>
+              <w:bottom w:val="single" w:color="B9C8C4" w:sz="4"/>
+              <w:right w:val="single" w:color="B9C8C4" w:sz="4"/>
+            </w:tcBorders>
+            <w:tcMar>
+              <w:top w:type="dxa" w:w="60"/>
+              <w:left w:type="dxa" w:w="90"/>
+              <w:bottom w:type="dxa" w:w="60"/>
+              <w:right w:type="dxa" w:w="90"/>
+            </w:tcMar>
+          </w:tcPr>
+          <w:p>
+            <w:pPr>
+              <w:spacing w:after="0" w:line="260"/>
+            </w:pPr>
+            <w:r>
+              <w:rPr>
+                <w:b w:val="false"/>
+                <w:bCs w:val="false"/>
+                <w:sz w:val="18"/>
+                <w:szCs w:val="18"/>
+              </w:rPr>
+              <w:t xml:space="preserve">2%</w:t>
+            </w:r>
+          </w:p>
+        </w:tc>
+      </w:tr>
+      <w:tr>
+        <w:tc>
+          <w:tcPr>
+            <w:tcW w:type="dxa" w:w="3126"/>
+            <w:tcBorders>
+              <w:top w:val="single" w:color="B9C8C4" w:sz="4"/>
+              <w:left w:val="single" w:color="B9C8C4" w:sz="4"/>
+              <w:bottom w:val="single" w:color="B9C8C4" w:sz="4"/>
+              <w:right w:val="single" w:color="B9C8C4" w:sz="4"/>
+            </w:tcBorders>
+            <w:tcMar>
+              <w:top w:type="dxa" w:w="60"/>
+              <w:left w:type="dxa" w:w="90"/>
+              <w:bottom w:type="dxa" w:w="60"/>
+              <w:right w:type="dxa" w:w="90"/>
+            </w:tcMar>
+          </w:tcPr>
+          <w:p>
+            <w:pPr>
+              <w:spacing w:after="0" w:line="260"/>
+            </w:pPr>
+            <w:r>
+              <w:rPr>
+                <w:b w:val="false"/>
+                <w:bCs w:val="false"/>
+                <w:sz w:val="18"/>
+                <w:szCs w:val="18"/>
+              </w:rPr>
+              <w:t xml:space="preserve">울혈성 간병증</w:t>
+            </w:r>
+          </w:p>
+        </w:tc>
+        <w:tc>
+          <w:tcPr>
+            <w:tcW w:type="dxa" w:w="1302"/>
+            <w:tcBorders>
+              <w:top w:val="single" w:color="B9C8C4" w:sz="4"/>
+              <w:left w:val="single" w:color="B9C8C4" w:sz="4"/>
+              <w:bottom w:val="single" w:color="B9C8C4" w:sz="4"/>
+              <w:right w:val="single" w:color="B9C8C4" w:sz="4"/>
+            </w:tcBorders>
+            <w:tcMar>
+              <w:top w:type="dxa" w:w="60"/>
+              <w:left w:type="dxa" w:w="90"/>
+              <w:bottom w:type="dxa" w:w="60"/>
+              <w:right w:type="dxa" w:w="90"/>
+            </w:tcMar>
+          </w:tcPr>
+          <w:p>
+            <w:pPr>
+              <w:spacing w:after="0" w:line="260"/>
+            </w:pPr>
+            <w:r>
+              <w:rPr>
+                <w:b w:val="false"/>
+                <w:bCs w:val="false"/>
+                <w:sz w:val="18"/>
+                <w:szCs w:val="18"/>
+              </w:rPr>
+              <w:t xml:space="preserve">10%</w:t>
+            </w:r>
+          </w:p>
+        </w:tc>
+        <w:tc>
+          <w:tcPr>
+            <w:tcW w:type="dxa" w:w="1302"/>
+            <w:tcBorders>
+              <w:top w:val="single" w:color="B9C8C4" w:sz="4"/>
+              <w:left w:val="single" w:color="B9C8C4" w:sz="4"/>
+              <w:bottom w:val="single" w:color="B9C8C4" w:sz="4"/>
+              <w:right w:val="single" w:color="B9C8C4" w:sz="4"/>
+            </w:tcBorders>
+            <w:tcMar>
+              <w:top w:type="dxa" w:w="60"/>
+              <w:left w:type="dxa" w:w="90"/>
+              <w:bottom w:type="dxa" w:w="60"/>
+              <w:right w:type="dxa" w:w="90"/>
+            </w:tcMar>
+          </w:tcPr>
+          <w:p>
+            <w:pPr>
+              <w:spacing w:after="0" w:line="260"/>
+            </w:pPr>
+            <w:r>
+              <w:rPr>
+                <w:b w:val="false"/>
+                <w:bCs w:val="false"/>
+                <w:sz w:val="18"/>
+                <w:szCs w:val="18"/>
+              </w:rPr>
+              <w:t xml:space="preserve">8%</w:t>
+            </w:r>
+          </w:p>
+        </w:tc>
+        <w:tc>
+          <w:tcPr>
+            <w:tcW w:type="dxa" w:w="1302"/>
+            <w:tcBorders>
+              <w:top w:val="single" w:color="B9C8C4" w:sz="4"/>
+              <w:left w:val="single" w:color="B9C8C4" w:sz="4"/>
+              <w:bottom w:val="single" w:color="B9C8C4" w:sz="4"/>
+              <w:right w:val="single" w:color="B9C8C4" w:sz="4"/>
+            </w:tcBorders>
+            <w:tcMar>
+              <w:top w:type="dxa" w:w="60"/>
+              <w:left w:type="dxa" w:w="90"/>
+              <w:bottom w:type="dxa" w:w="60"/>
+              <w:right w:type="dxa" w:w="90"/>
+            </w:tcMar>
+          </w:tcPr>
+          <w:p>
+            <w:pPr>
+              <w:spacing w:after="0" w:line="260"/>
+            </w:pPr>
+            <w:r>
+              <w:rPr>
+                <w:b w:val="false"/>
+                <w:bCs w:val="false"/>
+                <w:sz w:val="18"/>
+                <w:szCs w:val="18"/>
+              </w:rPr>
+              <w:t xml:space="preserve">12%</w:t>
+            </w:r>
+          </w:p>
+        </w:tc>
+        <w:tc>
+          <w:tcPr>
+            <w:tcW w:type="dxa" w:w="1302"/>
+            <w:tcBorders>
+              <w:top w:val="single" w:color="B9C8C4" w:sz="4"/>
+              <w:left w:val="single" w:color="B9C8C4" w:sz="4"/>
+              <w:bottom w:val="single" w:color="B9C8C4" w:sz="4"/>
+              <w:right w:val="single" w:color="B9C8C4" w:sz="4"/>
+            </w:tcBorders>
+            <w:tcMar>
+              <w:top w:type="dxa" w:w="60"/>
+              <w:left w:type="dxa" w:w="90"/>
+              <w:bottom w:type="dxa" w:w="60"/>
+              <w:right w:type="dxa" w:w="90"/>
+            </w:tcMar>
+          </w:tcPr>
+          <w:p>
+            <w:pPr>
+              <w:spacing w:after="0" w:line="260"/>
+            </w:pPr>
+            <w:r>
+              <w:rPr>
+                <w:b w:val="false"/>
+                <w:bCs w:val="false"/>
+                <w:sz w:val="18"/>
+                <w:szCs w:val="18"/>
+              </w:rPr>
+              <w:t xml:space="preserve">6%</w:t>
+            </w:r>
+          </w:p>
+        </w:tc>
+        <w:tc>
+          <w:tcPr>
+            <w:tcW w:type="dxa" w:w="1304"/>
+            <w:tcBorders>
+              <w:top w:val="single" w:color="B9C8C4" w:sz="4"/>
+              <w:left w:val="single" w:color="B9C8C4" w:sz="4"/>
+              <w:bottom w:val="single" w:color="B9C8C4" w:sz="4"/>
+              <w:right w:val="single" w:color="B9C8C4" w:sz="4"/>
+            </w:tcBorders>
+            <w:tcMar>
+              <w:top w:type="dxa" w:w="60"/>
+              <w:left w:type="dxa" w:w="90"/>
+              <w:bottom w:type="dxa" w:w="60"/>
+              <w:right w:type="dxa" w:w="90"/>
+            </w:tcMar>
+          </w:tcPr>
+          <w:p>
+            <w:pPr>
+              <w:spacing w:after="0" w:line="260"/>
+            </w:pPr>
+            <w:r>
+              <w:rPr>
+                <w:b w:val="false"/>
+                <w:bCs w:val="false"/>
+                <w:sz w:val="18"/>
+                <w:szCs w:val="18"/>
+              </w:rPr>
+              <w:t xml:space="preserve">8%</w:t>
+            </w:r>
+          </w:p>
+        </w:tc>
+      </w:tr>
+      <w:tr>
+        <w:tc>
+          <w:tcPr>
+            <w:tcW w:type="dxa" w:w="3126"/>
+            <w:tcBorders>
+              <w:top w:val="single" w:color="B9C8C4" w:sz="4"/>
+              <w:left w:val="single" w:color="B9C8C4" w:sz="4"/>
+              <w:bottom w:val="single" w:color="B9C8C4" w:sz="4"/>
+              <w:right w:val="single" w:color="B9C8C4" w:sz="4"/>
+            </w:tcBorders>
+            <w:tcMar>
+              <w:top w:type="dxa" w:w="60"/>
+              <w:left w:type="dxa" w:w="90"/>
+              <w:bottom w:type="dxa" w:w="60"/>
+              <w:right w:type="dxa" w:w="90"/>
+            </w:tcMar>
+          </w:tcPr>
+          <w:p>
+            <w:pPr>
+              <w:spacing w:after="0" w:line="260"/>
+            </w:pPr>
+            <w:r>
+              <w:rPr>
+                <w:b w:val="false"/>
+                <w:bCs w:val="false"/>
+                <w:sz w:val="18"/>
+                <w:szCs w:val="18"/>
+              </w:rPr>
+              <w:t xml:space="preserve">패혈증 담즙정체</w:t>
+            </w:r>
+          </w:p>
+        </w:tc>
+        <w:tc>
+          <w:tcPr>
+            <w:tcW w:type="dxa" w:w="1302"/>
+            <w:tcBorders>
+              <w:top w:val="single" w:color="B9C8C4" w:sz="4"/>
+              <w:left w:val="single" w:color="B9C8C4" w:sz="4"/>
+              <w:bottom w:val="single" w:color="B9C8C4" w:sz="4"/>
+              <w:right w:val="single" w:color="B9C8C4" w:sz="4"/>
+            </w:tcBorders>
+            <w:tcMar>
+              <w:top w:type="dxa" w:w="60"/>
+              <w:left w:type="dxa" w:w="90"/>
+              <w:bottom w:type="dxa" w:w="60"/>
+              <w:right w:type="dxa" w:w="90"/>
+            </w:tcMar>
+          </w:tcPr>
+          <w:p>
+            <w:pPr>
+              <w:spacing w:after="0" w:line="260"/>
+            </w:pPr>
+            <w:r>
+              <w:rPr>
+                <w:b w:val="false"/>
+                <w:bCs w:val="false"/>
+                <w:sz w:val="18"/>
+                <w:szCs w:val="18"/>
+              </w:rPr>
+              <w:t xml:space="preserve">2%</w:t>
+            </w:r>
+          </w:p>
+        </w:tc>
+        <w:tc>
+          <w:tcPr>
+            <w:tcW w:type="dxa" w:w="1302"/>
+            <w:tcBorders>
+              <w:top w:val="single" w:color="B9C8C4" w:sz="4"/>
+              <w:left w:val="single" w:color="B9C8C4" w:sz="4"/>
+              <w:bottom w:val="single" w:color="B9C8C4" w:sz="4"/>
+              <w:right w:val="single" w:color="B9C8C4" w:sz="4"/>
+            </w:tcBorders>
+            <w:tcMar>
+              <w:top w:type="dxa" w:w="60"/>
+              <w:left w:type="dxa" w:w="90"/>
+              <w:bottom w:type="dxa" w:w="60"/>
+              <w:right w:type="dxa" w:w="90"/>
+            </w:tcMar>
+          </w:tcPr>
+          <w:p>
+            <w:pPr>
+              <w:spacing w:after="0" w:line="260"/>
+            </w:pPr>
+            <w:r>
+              <w:rPr>
+                <w:b w:val="false"/>
+                <w:bCs w:val="false"/>
+                <w:sz w:val="18"/>
+                <w:szCs w:val="18"/>
+              </w:rPr>
+              <w:t xml:space="preserve">1%</w:t>
+            </w:r>
+          </w:p>
+        </w:tc>
+        <w:tc>
+          <w:tcPr>
+            <w:tcW w:type="dxa" w:w="1302"/>
+            <w:tcBorders>
+              <w:top w:val="single" w:color="B9C8C4" w:sz="4"/>
+              <w:left w:val="single" w:color="B9C8C4" w:sz="4"/>
+              <w:bottom w:val="single" w:color="B9C8C4" w:sz="4"/>
+              <w:right w:val="single" w:color="B9C8C4" w:sz="4"/>
+            </w:tcBorders>
+            <w:tcMar>
+              <w:top w:type="dxa" w:w="60"/>
+              <w:left w:type="dxa" w:w="90"/>
+              <w:bottom w:type="dxa" w:w="60"/>
+              <w:right w:type="dxa" w:w="90"/>
+            </w:tcMar>
+          </w:tcPr>
+          <w:p>
+            <w:pPr>
+              <w:spacing w:after="0" w:line="260"/>
+            </w:pPr>
+            <w:r>
+              <w:rPr>
+                <w:b w:val="false"/>
+                <w:bCs w:val="false"/>
+                <w:sz w:val="18"/>
+                <w:szCs w:val="18"/>
+              </w:rPr>
+              <w:t xml:space="preserve">76%</w:t>
+            </w:r>
+          </w:p>
+        </w:tc>
+        <w:tc>
+          <w:tcPr>
+            <w:tcW w:type="dxa" w:w="1302"/>
+            <w:tcBorders>
+              <w:top w:val="single" w:color="B9C8C4" w:sz="4"/>
+              <w:left w:val="single" w:color="B9C8C4" w:sz="4"/>
+              <w:bottom w:val="single" w:color="B9C8C4" w:sz="4"/>
+              <w:right w:val="single" w:color="B9C8C4" w:sz="4"/>
+            </w:tcBorders>
+            <w:tcMar>
+              <w:top w:type="dxa" w:w="60"/>
+              <w:left w:type="dxa" w:w="90"/>
+              <w:bottom w:type="dxa" w:w="60"/>
+              <w:right w:type="dxa" w:w="90"/>
+            </w:tcMar>
+          </w:tcPr>
+          <w:p>
+            <w:pPr>
+              <w:spacing w:after="0" w:line="260"/>
+            </w:pPr>
+            <w:r>
+              <w:rPr>
+                <w:b w:val="false"/>
+                <w:bCs w:val="false"/>
+                <w:sz w:val="18"/>
+                <w:szCs w:val="18"/>
+              </w:rPr>
+              <w:t xml:space="preserve">71%</w:t>
+            </w:r>
+          </w:p>
+        </w:tc>
+        <w:tc>
+          <w:tcPr>
+            <w:tcW w:type="dxa" w:w="1304"/>
+            <w:tcBorders>
+              <w:top w:val="single" w:color="B9C8C4" w:sz="4"/>
+              <w:left w:val="single" w:color="B9C8C4" w:sz="4"/>
+              <w:bottom w:val="single" w:color="B9C8C4" w:sz="4"/>
+              <w:right w:val="single" w:color="B9C8C4" w:sz="4"/>
+            </w:tcBorders>
+            <w:tcMar>
+              <w:top w:type="dxa" w:w="60"/>
+              <w:left w:type="dxa" w:w="90"/>
+              <w:bottom w:type="dxa" w:w="60"/>
+              <w:right w:type="dxa" w:w="90"/>
+            </w:tcMar>
+          </w:tcPr>
+          <w:p>
+            <w:pPr>
+              <w:spacing w:after="0" w:line="260"/>
+            </w:pPr>
+            <w:r>
+              <w:rPr>
+                <w:b w:val="false"/>
+                <w:bCs w:val="false"/>
+                <w:sz w:val="18"/>
+                <w:szCs w:val="18"/>
+              </w:rPr>
+              <w:t xml:space="preserve">84%</w:t>
+            </w:r>
+          </w:p>
+        </w:tc>
+      </w:tr>
+      <w:tr>
+        <w:tc>
+          <w:tcPr>
+            <w:tcW w:type="dxa" w:w="3126"/>
+            <w:tcBorders>
+              <w:top w:val="single" w:color="B9C8C4" w:sz="4"/>
+              <w:left w:val="single" w:color="B9C8C4" w:sz="4"/>
+              <w:bottom w:val="single" w:color="B9C8C4" w:sz="4"/>
+              <w:right w:val="single" w:color="B9C8C4" w:sz="4"/>
+            </w:tcBorders>
+            <w:tcMar>
+              <w:top w:type="dxa" w:w="60"/>
+              <w:left w:type="dxa" w:w="90"/>
+              <w:bottom w:type="dxa" w:w="60"/>
+              <w:right w:type="dxa" w:w="90"/>
+            </w:tcMar>
+          </w:tcPr>
+          <w:p>
+            <w:pPr>
+              <w:spacing w:after="0" w:line="260"/>
+            </w:pPr>
+            <w:r>
+              <w:rPr>
+                <w:b w:val="false"/>
+                <w:bCs w:val="false"/>
+                <w:sz w:val="18"/>
+                <w:szCs w:val="18"/>
+              </w:rPr>
+              <w:t xml:space="preserve">DILI</w:t>
+            </w:r>
+          </w:p>
+        </w:tc>
+        <w:tc>
+          <w:tcPr>
+            <w:tcW w:type="dxa" w:w="1302"/>
+            <w:tcBorders>
+              <w:top w:val="single" w:color="B9C8C4" w:sz="4"/>
+              <w:left w:val="single" w:color="B9C8C4" w:sz="4"/>
+              <w:bottom w:val="single" w:color="B9C8C4" w:sz="4"/>
+              <w:right w:val="single" w:color="B9C8C4" w:sz="4"/>
+            </w:tcBorders>
+            <w:tcMar>
+              <w:top w:type="dxa" w:w="60"/>
+              <w:left w:type="dxa" w:w="90"/>
+              <w:bottom w:type="dxa" w:w="60"/>
+              <w:right w:type="dxa" w:w="90"/>
+            </w:tcMar>
+          </w:tcPr>
+          <w:p>
+            <w:pPr>
+              <w:spacing w:after="0" w:line="260"/>
+            </w:pPr>
+            <w:r>
+              <w:rPr>
+                <w:b w:val="false"/>
+                <w:bCs w:val="false"/>
+                <w:sz w:val="18"/>
+                <w:szCs w:val="18"/>
+              </w:rPr>
+              <w:t xml:space="preserve">6%</w:t>
+            </w:r>
+          </w:p>
+        </w:tc>
+        <w:tc>
+          <w:tcPr>
+            <w:tcW w:type="dxa" w:w="1302"/>
+            <w:tcBorders>
+              <w:top w:val="single" w:color="B9C8C4" w:sz="4"/>
+              <w:left w:val="single" w:color="B9C8C4" w:sz="4"/>
+              <w:bottom w:val="single" w:color="B9C8C4" w:sz="4"/>
+              <w:right w:val="single" w:color="B9C8C4" w:sz="4"/>
+            </w:tcBorders>
+            <w:tcMar>
+              <w:top w:type="dxa" w:w="60"/>
+              <w:left w:type="dxa" w:w="90"/>
+              <w:bottom w:type="dxa" w:w="60"/>
+              <w:right w:type="dxa" w:w="90"/>
+            </w:tcMar>
+          </w:tcPr>
+          <w:p>
+            <w:pPr>
+              <w:spacing w:after="0" w:line="260"/>
+            </w:pPr>
+            <w:r>
+              <w:rPr>
+                <w:b w:val="false"/>
+                <w:bCs w:val="false"/>
+                <w:sz w:val="18"/>
+                <w:szCs w:val="18"/>
+              </w:rPr>
+              <w:t xml:space="preserve">10%</w:t>
+            </w:r>
+          </w:p>
+        </w:tc>
+        <w:tc>
+          <w:tcPr>
+            <w:tcW w:type="dxa" w:w="1302"/>
+            <w:tcBorders>
+              <w:top w:val="single" w:color="B9C8C4" w:sz="4"/>
+              <w:left w:val="single" w:color="B9C8C4" w:sz="4"/>
+              <w:bottom w:val="single" w:color="B9C8C4" w:sz="4"/>
+              <w:right w:val="single" w:color="B9C8C4" w:sz="4"/>
+            </w:tcBorders>
+            <w:tcMar>
+              <w:top w:type="dxa" w:w="60"/>
+              <w:left w:type="dxa" w:w="90"/>
+              <w:bottom w:type="dxa" w:w="60"/>
+              <w:right w:type="dxa" w:w="90"/>
+            </w:tcMar>
+          </w:tcPr>
+          <w:p>
+            <w:pPr>
+              <w:spacing w:after="0" w:line="260"/>
+            </w:pPr>
+            <w:r>
+              <w:rPr>
+                <w:b w:val="false"/>
+                <w:bCs w:val="false"/>
+                <w:sz w:val="18"/>
+                <w:szCs w:val="18"/>
+              </w:rPr>
+              <w:t xml:space="preserve">11%</w:t>
+            </w:r>
+          </w:p>
+        </w:tc>
+        <w:tc>
+          <w:tcPr>
+            <w:tcW w:type="dxa" w:w="1302"/>
+            <w:tcBorders>
+              <w:top w:val="single" w:color="B9C8C4" w:sz="4"/>
+              <w:left w:val="single" w:color="B9C8C4" w:sz="4"/>
+              <w:bottom w:val="single" w:color="B9C8C4" w:sz="4"/>
+              <w:right w:val="single" w:color="B9C8C4" w:sz="4"/>
+            </w:tcBorders>
+            <w:tcMar>
+              <w:top w:type="dxa" w:w="60"/>
+              <w:left w:type="dxa" w:w="90"/>
+              <w:bottom w:type="dxa" w:w="60"/>
+              <w:right w:type="dxa" w:w="90"/>
+            </w:tcMar>
+          </w:tcPr>
+          <w:p>
+            <w:pPr>
+              <w:spacing w:after="0" w:line="260"/>
+            </w:pPr>
+            <w:r>
+              <w:rPr>
+                <w:b w:val="false"/>
+                <w:bCs w:val="false"/>
+                <w:sz w:val="18"/>
+                <w:szCs w:val="18"/>
+              </w:rPr>
+              <w:t xml:space="preserve">5%</w:t>
+            </w:r>
+          </w:p>
+        </w:tc>
+        <w:tc>
+          <w:tcPr>
+            <w:tcW w:type="dxa" w:w="1304"/>
+            <w:tcBorders>
+              <w:top w:val="single" w:color="B9C8C4" w:sz="4"/>
+              <w:left w:val="single" w:color="B9C8C4" w:sz="4"/>
+              <w:bottom w:val="single" w:color="B9C8C4" w:sz="4"/>
+              <w:right w:val="single" w:color="B9C8C4" w:sz="4"/>
+            </w:tcBorders>
+            <w:tcMar>
+              <w:top w:type="dxa" w:w="60"/>
+              <w:left w:type="dxa" w:w="90"/>
+              <w:bottom w:type="dxa" w:w="60"/>
+              <w:right w:type="dxa" w:w="90"/>
+            </w:tcMar>
+          </w:tcPr>
+          <w:p>
+            <w:pPr>
+              <w:spacing w:after="0" w:line="260"/>
+            </w:pPr>
+            <w:r>
+              <w:rPr>
+                <w:b w:val="false"/>
+                <w:bCs w:val="false"/>
+                <w:sz w:val="18"/>
+                <w:szCs w:val="18"/>
+              </w:rPr>
+              <w:t xml:space="preserve">7%</w:t>
+            </w:r>
+          </w:p>
+        </w:tc>
+      </w:tr>
+      <w:tr>
+        <w:tc>
+          <w:tcPr>
+            <w:tcW w:type="dxa" w:w="3126"/>
+            <w:tcBorders>
+              <w:top w:val="single" w:color="B9C8C4" w:sz="4"/>
+              <w:left w:val="single" w:color="B9C8C4" w:sz="4"/>
+              <w:bottom w:val="single" w:color="B9C8C4" w:sz="4"/>
+              <w:right w:val="single" w:color="B9C8C4" w:sz="4"/>
+            </w:tcBorders>
+            <w:tcMar>
+              <w:top w:type="dxa" w:w="60"/>
+              <w:left w:type="dxa" w:w="90"/>
+              <w:bottom w:type="dxa" w:w="60"/>
+              <w:right w:type="dxa" w:w="90"/>
+            </w:tcMar>
+          </w:tcPr>
+          <w:p>
+            <w:pPr>
+              <w:spacing w:after="0" w:line="260"/>
+            </w:pPr>
+            <w:r>
+              <w:rPr>
+                <w:b w:val="false"/>
+                <w:bCs w:val="false"/>
+                <w:sz w:val="18"/>
+                <w:szCs w:val="18"/>
+              </w:rPr>
+              <w:t xml:space="preserve">정맥영양 관련</w:t>
+            </w:r>
+          </w:p>
+        </w:tc>
+        <w:tc>
+          <w:tcPr>
+            <w:tcW w:type="dxa" w:w="1302"/>
+            <w:tcBorders>
+              <w:top w:val="single" w:color="B9C8C4" w:sz="4"/>
+              <w:left w:val="single" w:color="B9C8C4" w:sz="4"/>
+              <w:bottom w:val="single" w:color="B9C8C4" w:sz="4"/>
+              <w:right w:val="single" w:color="B9C8C4" w:sz="4"/>
+            </w:tcBorders>
+            <w:tcMar>
+              <w:top w:type="dxa" w:w="60"/>
+              <w:left w:type="dxa" w:w="90"/>
+              <w:bottom w:type="dxa" w:w="60"/>
+              <w:right w:type="dxa" w:w="90"/>
+            </w:tcMar>
+          </w:tcPr>
+          <w:p>
+            <w:pPr>
+              <w:spacing w:after="0" w:line="260"/>
+            </w:pPr>
+            <w:r>
+              <w:rPr>
+                <w:b w:val="false"/>
+                <w:bCs w:val="false"/>
+                <w:sz w:val="18"/>
+                <w:szCs w:val="18"/>
+              </w:rPr>
+              <w:t xml:space="preserve">0%</w:t>
+            </w:r>
+          </w:p>
+        </w:tc>
+        <w:tc>
+          <w:tcPr>
+            <w:tcW w:type="dxa" w:w="1302"/>
+            <w:tcBorders>
+              <w:top w:val="single" w:color="B9C8C4" w:sz="4"/>
+              <w:left w:val="single" w:color="B9C8C4" w:sz="4"/>
+              <w:bottom w:val="single" w:color="B9C8C4" w:sz="4"/>
+              <w:right w:val="single" w:color="B9C8C4" w:sz="4"/>
+            </w:tcBorders>
+            <w:tcMar>
+              <w:top w:type="dxa" w:w="60"/>
+              <w:left w:type="dxa" w:w="90"/>
+              <w:bottom w:type="dxa" w:w="60"/>
+              <w:right w:type="dxa" w:w="90"/>
+            </w:tcMar>
+          </w:tcPr>
+          <w:p>
+            <w:pPr>
+              <w:spacing w:after="0" w:line="260"/>
+            </w:pPr>
+            <w:r>
+              <w:rPr>
+                <w:b w:val="false"/>
+                <w:bCs w:val="false"/>
+                <w:sz w:val="18"/>
+                <w:szCs w:val="18"/>
+              </w:rPr>
+              <w:t xml:space="preserve">&lt;10</w:t>
+            </w:r>
+          </w:p>
+        </w:tc>
+        <w:tc>
+          <w:tcPr>
+            <w:tcW w:type="dxa" w:w="1302"/>
+            <w:tcBorders>
+              <w:top w:val="single" w:color="B9C8C4" w:sz="4"/>
+              <w:left w:val="single" w:color="B9C8C4" w:sz="4"/>
+              <w:bottom w:val="single" w:color="B9C8C4" w:sz="4"/>
+              <w:right w:val="single" w:color="B9C8C4" w:sz="4"/>
+            </w:tcBorders>
+            <w:tcMar>
+              <w:top w:type="dxa" w:w="60"/>
+              <w:left w:type="dxa" w:w="90"/>
+              <w:bottom w:type="dxa" w:w="60"/>
+              <w:right w:type="dxa" w:w="90"/>
+            </w:tcMar>
+          </w:tcPr>
+          <w:p>
+            <w:pPr>
+              <w:spacing w:after="0" w:line="260"/>
+            </w:pPr>
+            <w:r>
+              <w:rPr>
+                <w:b w:val="false"/>
+                <w:bCs w:val="false"/>
+                <w:sz w:val="18"/>
+                <w:szCs w:val="18"/>
+              </w:rPr>
+              <w:t xml:space="preserve">2%</w:t>
+            </w:r>
+          </w:p>
+        </w:tc>
+        <w:tc>
+          <w:tcPr>
+            <w:tcW w:type="dxa" w:w="1302"/>
+            <w:tcBorders>
+              <w:top w:val="single" w:color="B9C8C4" w:sz="4"/>
+              <w:left w:val="single" w:color="B9C8C4" w:sz="4"/>
+              <w:bottom w:val="single" w:color="B9C8C4" w:sz="4"/>
+              <w:right w:val="single" w:color="B9C8C4" w:sz="4"/>
+            </w:tcBorders>
+            <w:tcMar>
+              <w:top w:type="dxa" w:w="60"/>
+              <w:left w:type="dxa" w:w="90"/>
+              <w:bottom w:type="dxa" w:w="60"/>
+              <w:right w:type="dxa" w:w="90"/>
+            </w:tcMar>
+          </w:tcPr>
+          <w:p>
+            <w:pPr>
+              <w:spacing w:after="0" w:line="260"/>
+            </w:pPr>
+            <w:r>
+              <w:rPr>
+                <w:b w:val="false"/>
+                <w:bCs w:val="false"/>
+                <w:sz w:val="18"/>
+                <w:szCs w:val="18"/>
+              </w:rPr>
+              <w:t xml:space="preserve">&lt;10</w:t>
+            </w:r>
+          </w:p>
+        </w:tc>
+        <w:tc>
+          <w:tcPr>
+            <w:tcW w:type="dxa" w:w="1304"/>
+            <w:tcBorders>
+              <w:top w:val="single" w:color="B9C8C4" w:sz="4"/>
+              <w:left w:val="single" w:color="B9C8C4" w:sz="4"/>
+              <w:bottom w:val="single" w:color="B9C8C4" w:sz="4"/>
+              <w:right w:val="single" w:color="B9C8C4" w:sz="4"/>
+            </w:tcBorders>
+            <w:tcMar>
+              <w:top w:type="dxa" w:w="60"/>
+              <w:left w:type="dxa" w:w="90"/>
+              <w:bottom w:type="dxa" w:w="60"/>
+              <w:right w:type="dxa" w:w="90"/>
+            </w:tcMar>
+          </w:tcPr>
+          <w:p>
+            <w:pPr>
+              <w:spacing w:after="0" w:line="260"/>
+            </w:pPr>
+            <w:r>
+              <w:rPr>
+                <w:b w:val="false"/>
+                <w:bCs w:val="false"/>
+                <w:sz w:val="18"/>
+                <w:szCs w:val="18"/>
+              </w:rPr>
+              <w:t xml:space="preserve">&lt;10</w:t>
+            </w:r>
+          </w:p>
+        </w:tc>
+      </w:tr>
+      <w:tr>
+        <w:tc>
+          <w:tcPr>
+            <w:tcW w:type="dxa" w:w="3126"/>
+            <w:tcBorders>
+              <w:top w:val="single" w:color="B9C8C4" w:sz="4"/>
+              <w:left w:val="single" w:color="B9C8C4" w:sz="4"/>
+              <w:bottom w:val="single" w:color="B9C8C4" w:sz="4"/>
+              <w:right w:val="single" w:color="B9C8C4" w:sz="4"/>
+            </w:tcBorders>
+            <w:tcMar>
+              <w:top w:type="dxa" w:w="60"/>
+              <w:left w:type="dxa" w:w="90"/>
+              <w:bottom w:type="dxa" w:w="60"/>
+              <w:right w:type="dxa" w:w="90"/>
+            </w:tcMar>
+          </w:tcPr>
+          <w:p>
+            <w:pPr>
+              <w:spacing w:after="0" w:line="260"/>
+            </w:pPr>
+            <w:r>
+              <w:rPr>
+                <w:b w:val="false"/>
+                <w:bCs w:val="false"/>
+                <w:sz w:val="18"/>
+                <w:szCs w:val="18"/>
+              </w:rPr>
+              <w:t xml:space="preserve">담도폐쇄·담관염</w:t>
+            </w:r>
+          </w:p>
+        </w:tc>
+        <w:tc>
+          <w:tcPr>
+            <w:tcW w:type="dxa" w:w="1302"/>
+            <w:tcBorders>
+              <w:top w:val="single" w:color="B9C8C4" w:sz="4"/>
+              <w:left w:val="single" w:color="B9C8C4" w:sz="4"/>
+              <w:bottom w:val="single" w:color="B9C8C4" w:sz="4"/>
+              <w:right w:val="single" w:color="B9C8C4" w:sz="4"/>
+            </w:tcBorders>
+            <w:tcMar>
+              <w:top w:type="dxa" w:w="60"/>
+              <w:left w:type="dxa" w:w="90"/>
+              <w:bottom w:type="dxa" w:w="60"/>
+              <w:right w:type="dxa" w:w="90"/>
+            </w:tcMar>
+          </w:tcPr>
+          <w:p>
+            <w:pPr>
+              <w:spacing w:after="0" w:line="260"/>
+            </w:pPr>
+            <w:r>
+              <w:rPr>
+                <w:b w:val="false"/>
+                <w:bCs w:val="false"/>
+                <w:sz w:val="18"/>
+                <w:szCs w:val="18"/>
+              </w:rPr>
+              <w:t xml:space="preserve">73%</w:t>
+            </w:r>
+          </w:p>
+        </w:tc>
+        <w:tc>
+          <w:tcPr>
+            <w:tcW w:type="dxa" w:w="1302"/>
+            <w:tcBorders>
+              <w:top w:val="single" w:color="B9C8C4" w:sz="4"/>
+              <w:left w:val="single" w:color="B9C8C4" w:sz="4"/>
+              <w:bottom w:val="single" w:color="B9C8C4" w:sz="4"/>
+              <w:right w:val="single" w:color="B9C8C4" w:sz="4"/>
+            </w:tcBorders>
+            <w:tcMar>
+              <w:top w:type="dxa" w:w="60"/>
+              <w:left w:type="dxa" w:w="90"/>
+              <w:bottom w:type="dxa" w:w="60"/>
+              <w:right w:type="dxa" w:w="90"/>
+            </w:tcMar>
+          </w:tcPr>
+          <w:p>
+            <w:pPr>
+              <w:spacing w:after="0" w:line="260"/>
+            </w:pPr>
+            <w:r>
+              <w:rPr>
+                <w:b w:val="false"/>
+                <w:bCs w:val="false"/>
+                <w:sz w:val="18"/>
+                <w:szCs w:val="18"/>
+              </w:rPr>
+              <w:t xml:space="preserve">69%</w:t>
+            </w:r>
+          </w:p>
+        </w:tc>
+        <w:tc>
+          <w:tcPr>
+            <w:tcW w:type="dxa" w:w="1302"/>
+            <w:tcBorders>
+              <w:top w:val="single" w:color="B9C8C4" w:sz="4"/>
+              <w:left w:val="single" w:color="B9C8C4" w:sz="4"/>
+              <w:bottom w:val="single" w:color="B9C8C4" w:sz="4"/>
+              <w:right w:val="single" w:color="B9C8C4" w:sz="4"/>
+            </w:tcBorders>
+            <w:tcMar>
+              <w:top w:type="dxa" w:w="60"/>
+              <w:left w:type="dxa" w:w="90"/>
+              <w:bottom w:type="dxa" w:w="60"/>
+              <w:right w:type="dxa" w:w="90"/>
+            </w:tcMar>
+          </w:tcPr>
+          <w:p>
+            <w:pPr>
+              <w:spacing w:after="0" w:line="260"/>
+            </w:pPr>
+            <w:r>
+              <w:rPr>
+                <w:b w:val="false"/>
+                <w:bCs w:val="false"/>
+                <w:sz w:val="18"/>
+                <w:szCs w:val="18"/>
+              </w:rPr>
+              <w:t xml:space="preserve">69%</w:t>
+            </w:r>
+          </w:p>
+        </w:tc>
+        <w:tc>
+          <w:tcPr>
+            <w:tcW w:type="dxa" w:w="1302"/>
+            <w:tcBorders>
+              <w:top w:val="single" w:color="B9C8C4" w:sz="4"/>
+              <w:left w:val="single" w:color="B9C8C4" w:sz="4"/>
+              <w:bottom w:val="single" w:color="B9C8C4" w:sz="4"/>
+              <w:right w:val="single" w:color="B9C8C4" w:sz="4"/>
+            </w:tcBorders>
+            <w:tcMar>
+              <w:top w:type="dxa" w:w="60"/>
+              <w:left w:type="dxa" w:w="90"/>
+              <w:bottom w:type="dxa" w:w="60"/>
+              <w:right w:type="dxa" w:w="90"/>
+            </w:tcMar>
+          </w:tcPr>
+          <w:p>
+            <w:pPr>
+              <w:spacing w:after="0" w:line="260"/>
+            </w:pPr>
+            <w:r>
+              <w:rPr>
+                <w:b w:val="false"/>
+                <w:bCs w:val="false"/>
+                <w:sz w:val="18"/>
+                <w:szCs w:val="18"/>
+              </w:rPr>
+              <w:t xml:space="preserve">72%</w:t>
+            </w:r>
+          </w:p>
+        </w:tc>
+        <w:tc>
+          <w:tcPr>
+            <w:tcW w:type="dxa" w:w="1304"/>
+            <w:tcBorders>
+              <w:top w:val="single" w:color="B9C8C4" w:sz="4"/>
+              <w:left w:val="single" w:color="B9C8C4" w:sz="4"/>
+              <w:bottom w:val="single" w:color="B9C8C4" w:sz="4"/>
+              <w:right w:val="single" w:color="B9C8C4" w:sz="4"/>
+            </w:tcBorders>
+            <w:tcMar>
+              <w:top w:type="dxa" w:w="60"/>
+              <w:left w:type="dxa" w:w="90"/>
+              <w:bottom w:type="dxa" w:w="60"/>
+              <w:right w:type="dxa" w:w="90"/>
+            </w:tcMar>
+          </w:tcPr>
+          <w:p>
+            <w:pPr>
+              <w:spacing w:after="0" w:line="260"/>
+            </w:pPr>
+            <w:r>
+              <w:rPr>
+                <w:b w:val="false"/>
+                <w:bCs w:val="false"/>
+                <w:sz w:val="18"/>
+                <w:szCs w:val="18"/>
+              </w:rPr>
+              <w:t xml:space="preserve">63%</w:t>
+            </w:r>
+          </w:p>
+        </w:tc>
+      </w:tr>
+      <w:tr>
+        <w:tc>
+          <w:tcPr>
+            <w:tcW w:type="dxa" w:w="3126"/>
+            <w:tcBorders>
+              <w:top w:val="single" w:color="B9C8C4" w:sz="4"/>
+              <w:left w:val="single" w:color="B9C8C4" w:sz="4"/>
+              <w:bottom w:val="single" w:color="B9C8C4" w:sz="4"/>
+              <w:right w:val="single" w:color="B9C8C4" w:sz="4"/>
+            </w:tcBorders>
+            <w:tcMar>
+              <w:top w:type="dxa" w:w="60"/>
+              <w:left w:type="dxa" w:w="90"/>
+              <w:bottom w:type="dxa" w:w="60"/>
+              <w:right w:type="dxa" w:w="90"/>
+            </w:tcMar>
+          </w:tcPr>
+          <w:p>
+            <w:pPr>
+              <w:spacing w:after="0" w:line="260"/>
+            </w:pPr>
+            <w:r>
+              <w:rPr>
+                <w:b w:val="false"/>
+                <w:bCs w:val="false"/>
+                <w:sz w:val="18"/>
+                <w:szCs w:val="18"/>
+              </w:rPr>
+              <w:t xml:space="preserve">담낭염</w:t>
+            </w:r>
+          </w:p>
+        </w:tc>
+        <w:tc>
+          <w:tcPr>
+            <w:tcW w:type="dxa" w:w="1302"/>
+            <w:tcBorders>
+              <w:top w:val="single" w:color="B9C8C4" w:sz="4"/>
+              <w:left w:val="single" w:color="B9C8C4" w:sz="4"/>
+              <w:bottom w:val="single" w:color="B9C8C4" w:sz="4"/>
+              <w:right w:val="single" w:color="B9C8C4" w:sz="4"/>
+            </w:tcBorders>
+            <w:tcMar>
+              <w:top w:type="dxa" w:w="60"/>
+              <w:left w:type="dxa" w:w="90"/>
+              <w:bottom w:type="dxa" w:w="60"/>
+              <w:right w:type="dxa" w:w="90"/>
+            </w:tcMar>
+          </w:tcPr>
+          <w:p>
+            <w:pPr>
+              <w:spacing w:after="0" w:line="260"/>
+            </w:pPr>
+            <w:r>
+              <w:rPr>
+                <w:b w:val="false"/>
+                <w:bCs w:val="false"/>
+                <w:sz w:val="18"/>
+                <w:szCs w:val="18"/>
+              </w:rPr>
+              <w:t xml:space="preserve">0%</w:t>
+            </w:r>
+          </w:p>
+        </w:tc>
+        <w:tc>
+          <w:tcPr>
+            <w:tcW w:type="dxa" w:w="1302"/>
+            <w:tcBorders>
+              <w:top w:val="single" w:color="B9C8C4" w:sz="4"/>
+              <w:left w:val="single" w:color="B9C8C4" w:sz="4"/>
+              <w:bottom w:val="single" w:color="B9C8C4" w:sz="4"/>
+              <w:right w:val="single" w:color="B9C8C4" w:sz="4"/>
+            </w:tcBorders>
+            <w:tcMar>
+              <w:top w:type="dxa" w:w="60"/>
+              <w:left w:type="dxa" w:w="90"/>
+              <w:bottom w:type="dxa" w:w="60"/>
+              <w:right w:type="dxa" w:w="90"/>
+            </w:tcMar>
+          </w:tcPr>
+          <w:p>
+            <w:pPr>
+              <w:spacing w:after="0" w:line="260"/>
+            </w:pPr>
+            <w:r>
+              <w:rPr>
+                <w:b w:val="false"/>
+                <w:bCs w:val="false"/>
+                <w:sz w:val="18"/>
+                <w:szCs w:val="18"/>
+              </w:rPr>
+              <w:t xml:space="preserve">0%</w:t>
+            </w:r>
+          </w:p>
+        </w:tc>
+        <w:tc>
+          <w:tcPr>
+            <w:tcW w:type="dxa" w:w="1302"/>
+            <w:tcBorders>
+              <w:top w:val="single" w:color="B9C8C4" w:sz="4"/>
+              <w:left w:val="single" w:color="B9C8C4" w:sz="4"/>
+              <w:bottom w:val="single" w:color="B9C8C4" w:sz="4"/>
+              <w:right w:val="single" w:color="B9C8C4" w:sz="4"/>
+            </w:tcBorders>
+            <w:tcMar>
+              <w:top w:type="dxa" w:w="60"/>
+              <w:left w:type="dxa" w:w="90"/>
+              <w:bottom w:type="dxa" w:w="60"/>
+              <w:right w:type="dxa" w:w="90"/>
+            </w:tcMar>
+          </w:tcPr>
+          <w:p>
+            <w:pPr>
+              <w:spacing w:after="0" w:line="260"/>
+            </w:pPr>
+            <w:r>
+              <w:rPr>
+                <w:b w:val="false"/>
+                <w:bCs w:val="false"/>
+                <w:sz w:val="18"/>
+                <w:szCs w:val="18"/>
+              </w:rPr>
+              <w:t xml:space="preserve">0%</w:t>
+            </w:r>
+          </w:p>
+        </w:tc>
+        <w:tc>
+          <w:tcPr>
+            <w:tcW w:type="dxa" w:w="1302"/>
+            <w:tcBorders>
+              <w:top w:val="single" w:color="B9C8C4" w:sz="4"/>
+              <w:left w:val="single" w:color="B9C8C4" w:sz="4"/>
+              <w:bottom w:val="single" w:color="B9C8C4" w:sz="4"/>
+              <w:right w:val="single" w:color="B9C8C4" w:sz="4"/>
+            </w:tcBorders>
+            <w:tcMar>
+              <w:top w:type="dxa" w:w="60"/>
+              <w:left w:type="dxa" w:w="90"/>
+              <w:bottom w:type="dxa" w:w="60"/>
+              <w:right w:type="dxa" w:w="90"/>
+            </w:tcMar>
+          </w:tcPr>
+          <w:p>
+            <w:pPr>
+              <w:spacing w:after="0" w:line="260"/>
+            </w:pPr>
+            <w:r>
+              <w:rPr>
+                <w:b w:val="false"/>
+                <w:bCs w:val="false"/>
+                <w:sz w:val="18"/>
+                <w:szCs w:val="18"/>
+              </w:rPr>
+              <w:t xml:space="preserve">0%</w:t>
+            </w:r>
+          </w:p>
+        </w:tc>
+        <w:tc>
+          <w:tcPr>
+            <w:tcW w:type="dxa" w:w="1304"/>
+            <w:tcBorders>
+              <w:top w:val="single" w:color="B9C8C4" w:sz="4"/>
+              <w:left w:val="single" w:color="B9C8C4" w:sz="4"/>
+              <w:bottom w:val="single" w:color="B9C8C4" w:sz="4"/>
+              <w:right w:val="single" w:color="B9C8C4" w:sz="4"/>
+            </w:tcBorders>
+            <w:tcMar>
+              <w:top w:type="dxa" w:w="60"/>
+              <w:left w:type="dxa" w:w="90"/>
+              <w:bottom w:type="dxa" w:w="60"/>
+              <w:right w:type="dxa" w:w="90"/>
+            </w:tcMar>
+          </w:tcPr>
+          <w:p>
+            <w:pPr>
+              <w:spacing w:after="0" w:line="260"/>
+            </w:pPr>
+            <w:r>
+              <w:rPr>
+                <w:b w:val="false"/>
+                <w:bCs w:val="false"/>
+                <w:sz w:val="18"/>
+                <w:szCs w:val="18"/>
+              </w:rPr>
+              <w:t xml:space="preserve">0%</w:t>
+            </w:r>
+          </w:p>
+        </w:tc>
+      </w:tr>
+      <w:tr>
+        <w:tc>
+          <w:tcPr>
+            <w:tcW w:type="dxa" w:w="3126"/>
+            <w:tcBorders>
+              <w:top w:val="single" w:color="B9C8C4" w:sz="4"/>
+              <w:left w:val="single" w:color="B9C8C4" w:sz="4"/>
+              <w:bottom w:val="single" w:color="B9C8C4" w:sz="4"/>
+              <w:right w:val="single" w:color="B9C8C4" w:sz="4"/>
+            </w:tcBorders>
+            <w:tcMar>
+              <w:top w:type="dxa" w:w="60"/>
+              <w:left w:type="dxa" w:w="90"/>
+              <w:bottom w:type="dxa" w:w="60"/>
+              <w:right w:type="dxa" w:w="90"/>
+            </w:tcMar>
+          </w:tcPr>
+          <w:p>
+            <w:pPr>
+              <w:spacing w:after="0" w:line="260"/>
+            </w:pPr>
+            <w:r>
+              <w:rPr>
+                <w:b w:val="false"/>
+                <w:bCs w:val="false"/>
+                <w:sz w:val="18"/>
+                <w:szCs w:val="18"/>
+              </w:rPr>
+              <w:t xml:space="preserve">용혈</w:t>
+            </w:r>
+          </w:p>
+        </w:tc>
+        <w:tc>
+          <w:tcPr>
+            <w:tcW w:type="dxa" w:w="1302"/>
+            <w:tcBorders>
+              <w:top w:val="single" w:color="B9C8C4" w:sz="4"/>
+              <w:left w:val="single" w:color="B9C8C4" w:sz="4"/>
+              <w:bottom w:val="single" w:color="B9C8C4" w:sz="4"/>
+              <w:right w:val="single" w:color="B9C8C4" w:sz="4"/>
+            </w:tcBorders>
+            <w:tcMar>
+              <w:top w:type="dxa" w:w="60"/>
+              <w:left w:type="dxa" w:w="90"/>
+              <w:bottom w:type="dxa" w:w="60"/>
+              <w:right w:type="dxa" w:w="90"/>
+            </w:tcMar>
+          </w:tcPr>
+          <w:p>
+            <w:pPr>
+              <w:spacing w:after="0" w:line="260"/>
+            </w:pPr>
+            <w:r>
+              <w:rPr>
+                <w:b w:val="false"/>
+                <w:bCs w:val="false"/>
+                <w:sz w:val="18"/>
+                <w:szCs w:val="18"/>
+              </w:rPr>
+              <w:t xml:space="preserve">1%</w:t>
+            </w:r>
+          </w:p>
+        </w:tc>
+        <w:tc>
+          <w:tcPr>
+            <w:tcW w:type="dxa" w:w="1302"/>
+            <w:tcBorders>
+              <w:top w:val="single" w:color="B9C8C4" w:sz="4"/>
+              <w:left w:val="single" w:color="B9C8C4" w:sz="4"/>
+              <w:bottom w:val="single" w:color="B9C8C4" w:sz="4"/>
+              <w:right w:val="single" w:color="B9C8C4" w:sz="4"/>
+            </w:tcBorders>
+            <w:tcMar>
+              <w:top w:type="dxa" w:w="60"/>
+              <w:left w:type="dxa" w:w="90"/>
+              <w:bottom w:type="dxa" w:w="60"/>
+              <w:right w:type="dxa" w:w="90"/>
+            </w:tcMar>
+          </w:tcPr>
+          <w:p>
+            <w:pPr>
+              <w:spacing w:after="0" w:line="260"/>
+            </w:pPr>
+            <w:r>
+              <w:rPr>
+                <w:b w:val="false"/>
+                <w:bCs w:val="false"/>
+                <w:sz w:val="18"/>
+                <w:szCs w:val="18"/>
+              </w:rPr>
+              <w:t xml:space="preserve">1%</w:t>
+            </w:r>
+          </w:p>
+        </w:tc>
+        <w:tc>
+          <w:tcPr>
+            <w:tcW w:type="dxa" w:w="1302"/>
+            <w:tcBorders>
+              <w:top w:val="single" w:color="B9C8C4" w:sz="4"/>
+              <w:left w:val="single" w:color="B9C8C4" w:sz="4"/>
+              <w:bottom w:val="single" w:color="B9C8C4" w:sz="4"/>
+              <w:right w:val="single" w:color="B9C8C4" w:sz="4"/>
+            </w:tcBorders>
+            <w:tcMar>
+              <w:top w:type="dxa" w:w="60"/>
+              <w:left w:type="dxa" w:w="90"/>
+              <w:bottom w:type="dxa" w:w="60"/>
+              <w:right w:type="dxa" w:w="90"/>
+            </w:tcMar>
+          </w:tcPr>
+          <w:p>
+            <w:pPr>
+              <w:spacing w:after="0" w:line="260"/>
+            </w:pPr>
+            <w:r>
+              <w:rPr>
+                <w:b w:val="false"/>
+                <w:bCs w:val="false"/>
+                <w:sz w:val="18"/>
+                <w:szCs w:val="18"/>
+              </w:rPr>
+              <w:t xml:space="preserve">&lt;10</w:t>
+            </w:r>
+          </w:p>
+        </w:tc>
+        <w:tc>
+          <w:tcPr>
+            <w:tcW w:type="dxa" w:w="1302"/>
+            <w:tcBorders>
+              <w:top w:val="single" w:color="B9C8C4" w:sz="4"/>
+              <w:left w:val="single" w:color="B9C8C4" w:sz="4"/>
+              <w:bottom w:val="single" w:color="B9C8C4" w:sz="4"/>
+              <w:right w:val="single" w:color="B9C8C4" w:sz="4"/>
+            </w:tcBorders>
+            <w:tcMar>
+              <w:top w:type="dxa" w:w="60"/>
+              <w:left w:type="dxa" w:w="90"/>
+              <w:bottom w:type="dxa" w:w="60"/>
+              <w:right w:type="dxa" w:w="90"/>
+            </w:tcMar>
+          </w:tcPr>
+          <w:p>
+            <w:pPr>
+              <w:spacing w:after="0" w:line="260"/>
+            </w:pPr>
+            <w:r>
+              <w:rPr>
+                <w:b w:val="false"/>
+                <w:bCs w:val="false"/>
+                <w:sz w:val="18"/>
+                <w:szCs w:val="18"/>
+              </w:rPr>
+              <w:t xml:space="preserve">1%</w:t>
+            </w:r>
+          </w:p>
+        </w:tc>
+        <w:tc>
+          <w:tcPr>
+            <w:tcW w:type="dxa" w:w="1304"/>
+            <w:tcBorders>
+              <w:top w:val="single" w:color="B9C8C4" w:sz="4"/>
+              <w:left w:val="single" w:color="B9C8C4" w:sz="4"/>
+              <w:bottom w:val="single" w:color="B9C8C4" w:sz="4"/>
+              <w:right w:val="single" w:color="B9C8C4" w:sz="4"/>
+            </w:tcBorders>
+            <w:tcMar>
+              <w:top w:type="dxa" w:w="60"/>
+              <w:left w:type="dxa" w:w="90"/>
+              <w:bottom w:type="dxa" w:w="60"/>
+              <w:right w:type="dxa" w:w="90"/>
+            </w:tcMar>
+          </w:tcPr>
+          <w:p>
+            <w:pPr>
+              <w:spacing w:after="0" w:line="260"/>
+            </w:pPr>
+            <w:r>
+              <w:rPr>
+                <w:b w:val="false"/>
+                <w:bCs w:val="false"/>
+                <w:sz w:val="18"/>
+                <w:szCs w:val="18"/>
+              </w:rPr>
+              <w:t xml:space="preserve">5%</w:t>
+            </w:r>
+          </w:p>
+        </w:tc>
+      </w:tr>
+      <w:tr>
+        <w:tc>
+          <w:tcPr>
+            <w:tcW w:type="dxa" w:w="3126"/>
+            <w:tcBorders>
+              <w:top w:val="single" w:color="B9C8C4" w:sz="4"/>
+              <w:left w:val="single" w:color="B9C8C4" w:sz="4"/>
+              <w:bottom w:val="single" w:color="B9C8C4" w:sz="4"/>
+              <w:right w:val="single" w:color="B9C8C4" w:sz="4"/>
+            </w:tcBorders>
+            <w:tcMar>
+              <w:top w:type="dxa" w:w="60"/>
+              <w:left w:type="dxa" w:w="90"/>
+              <w:bottom w:type="dxa" w:w="60"/>
+              <w:right w:type="dxa" w:w="90"/>
+            </w:tcMar>
+          </w:tcPr>
+          <w:p>
+            <w:pPr>
+              <w:spacing w:after="0" w:line="260"/>
+            </w:pPr>
+            <w:r>
+              <w:rPr>
+                <w:b w:val="false"/>
+                <w:bCs w:val="false"/>
+                <w:sz w:val="18"/>
+                <w:szCs w:val="18"/>
+              </w:rPr>
+              <w:t xml:space="preserve">바이러스 간염</w:t>
+            </w:r>
+          </w:p>
+        </w:tc>
+        <w:tc>
+          <w:tcPr>
+            <w:tcW w:type="dxa" w:w="1302"/>
+            <w:tcBorders>
+              <w:top w:val="single" w:color="B9C8C4" w:sz="4"/>
+              <w:left w:val="single" w:color="B9C8C4" w:sz="4"/>
+              <w:bottom w:val="single" w:color="B9C8C4" w:sz="4"/>
+              <w:right w:val="single" w:color="B9C8C4" w:sz="4"/>
+            </w:tcBorders>
+            <w:tcMar>
+              <w:top w:type="dxa" w:w="60"/>
+              <w:left w:type="dxa" w:w="90"/>
+              <w:bottom w:type="dxa" w:w="60"/>
+              <w:right w:type="dxa" w:w="90"/>
+            </w:tcMar>
+          </w:tcPr>
+          <w:p>
+            <w:pPr>
+              <w:spacing w:after="0" w:line="260"/>
+            </w:pPr>
+            <w:r>
+              <w:rPr>
+                <w:b w:val="false"/>
+                <w:bCs w:val="false"/>
+                <w:sz w:val="18"/>
+                <w:szCs w:val="18"/>
+              </w:rPr>
+              <w:t xml:space="preserve">3%</w:t>
+            </w:r>
+          </w:p>
+        </w:tc>
+        <w:tc>
+          <w:tcPr>
+            <w:tcW w:type="dxa" w:w="1302"/>
+            <w:tcBorders>
+              <w:top w:val="single" w:color="B9C8C4" w:sz="4"/>
+              <w:left w:val="single" w:color="B9C8C4" w:sz="4"/>
+              <w:bottom w:val="single" w:color="B9C8C4" w:sz="4"/>
+              <w:right w:val="single" w:color="B9C8C4" w:sz="4"/>
+            </w:tcBorders>
+            <w:tcMar>
+              <w:top w:type="dxa" w:w="60"/>
+              <w:left w:type="dxa" w:w="90"/>
+              <w:bottom w:type="dxa" w:w="60"/>
+              <w:right w:type="dxa" w:w="90"/>
+            </w:tcMar>
+          </w:tcPr>
+          <w:p>
+            <w:pPr>
+              <w:spacing w:after="0" w:line="260"/>
+            </w:pPr>
+            <w:r>
+              <w:rPr>
+                <w:b w:val="false"/>
+                <w:bCs w:val="false"/>
+                <w:sz w:val="18"/>
+                <w:szCs w:val="18"/>
+              </w:rPr>
+              <w:t xml:space="preserve">0%</w:t>
+            </w:r>
+          </w:p>
+        </w:tc>
+        <w:tc>
+          <w:tcPr>
+            <w:tcW w:type="dxa" w:w="1302"/>
+            <w:tcBorders>
+              <w:top w:val="single" w:color="B9C8C4" w:sz="4"/>
+              <w:left w:val="single" w:color="B9C8C4" w:sz="4"/>
+              <w:bottom w:val="single" w:color="B9C8C4" w:sz="4"/>
+              <w:right w:val="single" w:color="B9C8C4" w:sz="4"/>
+            </w:tcBorders>
+            <w:tcMar>
+              <w:top w:type="dxa" w:w="60"/>
+              <w:left w:type="dxa" w:w="90"/>
+              <w:bottom w:type="dxa" w:w="60"/>
+              <w:right w:type="dxa" w:w="90"/>
+            </w:tcMar>
+          </w:tcPr>
+          <w:p>
+            <w:pPr>
+              <w:spacing w:after="0" w:line="260"/>
+            </w:pPr>
+            <w:r>
+              <w:rPr>
+                <w:b w:val="false"/>
+                <w:bCs w:val="false"/>
+                <w:sz w:val="18"/>
+                <w:szCs w:val="18"/>
+              </w:rPr>
+              <w:t xml:space="preserve">0%</w:t>
+            </w:r>
+          </w:p>
+        </w:tc>
+        <w:tc>
+          <w:tcPr>
+            <w:tcW w:type="dxa" w:w="1302"/>
+            <w:tcBorders>
+              <w:top w:val="single" w:color="B9C8C4" w:sz="4"/>
+              <w:left w:val="single" w:color="B9C8C4" w:sz="4"/>
+              <w:bottom w:val="single" w:color="B9C8C4" w:sz="4"/>
+              <w:right w:val="single" w:color="B9C8C4" w:sz="4"/>
+            </w:tcBorders>
+            <w:tcMar>
+              <w:top w:type="dxa" w:w="60"/>
+              <w:left w:type="dxa" w:w="90"/>
+              <w:bottom w:type="dxa" w:w="60"/>
+              <w:right w:type="dxa" w:w="90"/>
+            </w:tcMar>
+          </w:tcPr>
+          <w:p>
+            <w:pPr>
+              <w:spacing w:after="0" w:line="260"/>
+            </w:pPr>
+            <w:r>
+              <w:rPr>
+                <w:b w:val="false"/>
+                <w:bCs w:val="false"/>
+                <w:sz w:val="18"/>
+                <w:szCs w:val="18"/>
+              </w:rPr>
+              <w:t xml:space="preserve">&lt;10</w:t>
+            </w:r>
+          </w:p>
+        </w:tc>
+        <w:tc>
+          <w:tcPr>
+            <w:tcW w:type="dxa" w:w="1304"/>
+            <w:tcBorders>
+              <w:top w:val="single" w:color="B9C8C4" w:sz="4"/>
+              <w:left w:val="single" w:color="B9C8C4" w:sz="4"/>
+              <w:bottom w:val="single" w:color="B9C8C4" w:sz="4"/>
+              <w:right w:val="single" w:color="B9C8C4" w:sz="4"/>
+            </w:tcBorders>
+            <w:tcMar>
+              <w:top w:type="dxa" w:w="60"/>
+              <w:left w:type="dxa" w:w="90"/>
+              <w:bottom w:type="dxa" w:w="60"/>
+              <w:right w:type="dxa" w:w="90"/>
+            </w:tcMar>
+          </w:tcPr>
+          <w:p>
+            <w:pPr>
+              <w:spacing w:after="0" w:line="260"/>
+            </w:pPr>
+            <w:r>
+              <w:rPr>
+                <w:b w:val="false"/>
+                <w:bCs w:val="false"/>
+                <w:sz w:val="18"/>
+                <w:szCs w:val="18"/>
+              </w:rPr>
+              <w:t xml:space="preserve">0%</w:t>
+            </w:r>
+          </w:p>
+        </w:tc>
+      </w:tr>
+      <w:tr>
+        <w:tc>
+          <w:tcPr>
+            <w:tcW w:type="dxa" w:w="3126"/>
+            <w:tcBorders>
+              <w:top w:val="single" w:color="B9C8C4" w:sz="4"/>
+              <w:left w:val="single" w:color="B9C8C4" w:sz="4"/>
+              <w:bottom w:val="single" w:color="B9C8C4" w:sz="4"/>
+              <w:right w:val="single" w:color="B9C8C4" w:sz="4"/>
+            </w:tcBorders>
+            <w:tcMar>
+              <w:top w:type="dxa" w:w="60"/>
+              <w:left w:type="dxa" w:w="90"/>
+              <w:bottom w:type="dxa" w:w="60"/>
+              <w:right w:type="dxa" w:w="90"/>
+            </w:tcMar>
+          </w:tcPr>
+          <w:p>
+            <w:pPr>
+              <w:spacing w:after="0" w:line="260"/>
+            </w:pPr>
+            <w:r>
+              <w:rPr>
+                <w:b w:val="false"/>
+                <w:bCs w:val="false"/>
+                <w:sz w:val="18"/>
+                <w:szCs w:val="18"/>
+              </w:rPr>
+              <w:t xml:space="preserve">기타</w:t>
+            </w:r>
+          </w:p>
+        </w:tc>
+        <w:tc>
+          <w:tcPr>
+            <w:tcW w:type="dxa" w:w="1302"/>
+            <w:tcBorders>
+              <w:top w:val="single" w:color="B9C8C4" w:sz="4"/>
+              <w:left w:val="single" w:color="B9C8C4" w:sz="4"/>
+              <w:bottom w:val="single" w:color="B9C8C4" w:sz="4"/>
+              <w:right w:val="single" w:color="B9C8C4" w:sz="4"/>
+            </w:tcBorders>
+            <w:tcMar>
+              <w:top w:type="dxa" w:w="60"/>
+              <w:left w:type="dxa" w:w="90"/>
+              <w:bottom w:type="dxa" w:w="60"/>
+              <w:right w:type="dxa" w:w="90"/>
+            </w:tcMar>
+          </w:tcPr>
+          <w:p>
+            <w:pPr>
+              <w:spacing w:after="0" w:line="260"/>
+            </w:pPr>
+            <w:r>
+              <w:rPr>
+                <w:b w:val="false"/>
+                <w:bCs w:val="false"/>
+                <w:sz w:val="18"/>
+                <w:szCs w:val="18"/>
+              </w:rPr>
+              <w:t xml:space="preserve">19%</w:t>
+            </w:r>
+          </w:p>
+        </w:tc>
+        <w:tc>
+          <w:tcPr>
+            <w:tcW w:type="dxa" w:w="1302"/>
+            <w:tcBorders>
+              <w:top w:val="single" w:color="B9C8C4" w:sz="4"/>
+              <w:left w:val="single" w:color="B9C8C4" w:sz="4"/>
+              <w:bottom w:val="single" w:color="B9C8C4" w:sz="4"/>
+              <w:right w:val="single" w:color="B9C8C4" w:sz="4"/>
+            </w:tcBorders>
+            <w:tcMar>
+              <w:top w:type="dxa" w:w="60"/>
+              <w:left w:type="dxa" w:w="90"/>
+              <w:bottom w:type="dxa" w:w="60"/>
+              <w:right w:type="dxa" w:w="90"/>
+            </w:tcMar>
+          </w:tcPr>
+          <w:p>
+            <w:pPr>
+              <w:spacing w:after="0" w:line="260"/>
+            </w:pPr>
+            <w:r>
+              <w:rPr>
+                <w:b w:val="false"/>
+                <w:bCs w:val="false"/>
+                <w:sz w:val="18"/>
+                <w:szCs w:val="18"/>
+              </w:rPr>
+              <w:t xml:space="preserve">23%</w:t>
+            </w:r>
+          </w:p>
+        </w:tc>
+        <w:tc>
+          <w:tcPr>
+            <w:tcW w:type="dxa" w:w="1302"/>
+            <w:tcBorders>
+              <w:top w:val="single" w:color="B9C8C4" w:sz="4"/>
+              <w:left w:val="single" w:color="B9C8C4" w:sz="4"/>
+              <w:bottom w:val="single" w:color="B9C8C4" w:sz="4"/>
+              <w:right w:val="single" w:color="B9C8C4" w:sz="4"/>
+            </w:tcBorders>
+            <w:tcMar>
+              <w:top w:type="dxa" w:w="60"/>
+              <w:left w:type="dxa" w:w="90"/>
+              <w:bottom w:type="dxa" w:w="60"/>
+              <w:right w:type="dxa" w:w="90"/>
+            </w:tcMar>
+          </w:tcPr>
+          <w:p>
+            <w:pPr>
+              <w:spacing w:after="0" w:line="260"/>
+            </w:pPr>
+            <w:r>
+              <w:rPr>
+                <w:b w:val="false"/>
+                <w:bCs w:val="false"/>
+                <w:sz w:val="18"/>
+                <w:szCs w:val="18"/>
+              </w:rPr>
+              <w:t xml:space="preserve">8%</w:t>
+            </w:r>
+          </w:p>
+        </w:tc>
+        <w:tc>
+          <w:tcPr>
+            <w:tcW w:type="dxa" w:w="1302"/>
+            <w:tcBorders>
+              <w:top w:val="single" w:color="B9C8C4" w:sz="4"/>
+              <w:left w:val="single" w:color="B9C8C4" w:sz="4"/>
+              <w:bottom w:val="single" w:color="B9C8C4" w:sz="4"/>
+              <w:right w:val="single" w:color="B9C8C4" w:sz="4"/>
+            </w:tcBorders>
+            <w:tcMar>
+              <w:top w:type="dxa" w:w="60"/>
+              <w:left w:type="dxa" w:w="90"/>
+              <w:bottom w:type="dxa" w:w="60"/>
+              <w:right w:type="dxa" w:w="90"/>
+            </w:tcMar>
+          </w:tcPr>
+          <w:p>
+            <w:pPr>
+              <w:spacing w:after="0" w:line="260"/>
+            </w:pPr>
+            <w:r>
+              <w:rPr>
+                <w:b w:val="false"/>
+                <w:bCs w:val="false"/>
+                <w:sz w:val="18"/>
+                <w:szCs w:val="18"/>
+              </w:rPr>
+              <w:t xml:space="preserve">17%</w:t>
+            </w:r>
+          </w:p>
+        </w:tc>
+        <w:tc>
+          <w:tcPr>
+            <w:tcW w:type="dxa" w:w="1304"/>
+            <w:tcBorders>
+              <w:top w:val="single" w:color="B9C8C4" w:sz="4"/>
+              <w:left w:val="single" w:color="B9C8C4" w:sz="4"/>
+              <w:bottom w:val="single" w:color="B9C8C4" w:sz="4"/>
+              <w:right w:val="single" w:color="B9C8C4" w:sz="4"/>
+            </w:tcBorders>
+            <w:tcMar>
+              <w:top w:type="dxa" w:w="60"/>
+              <w:left w:type="dxa" w:w="90"/>
+              <w:bottom w:type="dxa" w:w="60"/>
+              <w:right w:type="dxa" w:w="90"/>
+            </w:tcMar>
+          </w:tcPr>
+          <w:p>
+            <w:pPr>
+              <w:spacing w:after="0" w:line="260"/>
+            </w:pPr>
+            <w:r>
+              <w:rPr>
+                <w:b w:val="false"/>
+                <w:bCs w:val="false"/>
+                <w:sz w:val="18"/>
+                <w:szCs w:val="18"/>
+              </w:rPr>
+              <w:t xml:space="preserve">22%</w:t>
+            </w:r>
+          </w:p>
+        </w:tc>
+      </w:tr>
+    </w:tbl>
+    <w:p>
+      <w:pPr>
+        <w:pStyle w:val="Heading2"/>
+      </w:pPr>
+      <w:r>
+        <w:t xml:space="preserve">퇴원 진단 코드</w:t>
+      </w:r>
+    </w:p>
+    <w:tbl>
+      <w:tblPr>
+        <w:tblW w:type="dxa" w:w="9638"/>
+        <w:tblBorders>
+          <w:top w:val="single" w:color="auto" w:sz="4"/>
+          <w:left w:val="single" w:color="auto" w:sz="4"/>
+          <w:bottom w:val="single" w:color="auto" w:sz="4"/>
+          <w:right w:val="single" w:color="auto" w:sz="4"/>
+          <w:insideH w:val="single" w:color="auto" w:sz="4"/>
+          <w:insideV w:val="single" w:color="auto" w:sz="4"/>
+        </w:tblBorders>
+      </w:tblPr>
+      <w:tblGrid>
+        <w:gridCol w:w="3126"/>
+        <w:gridCol w:w="1302"/>
+        <w:gridCol w:w="1302"/>
+        <w:gridCol w:w="1302"/>
+        <w:gridCol w:w="1302"/>
+        <w:gridCol w:w="1304"/>
+      </w:tblGrid>
+      <w:tr>
+        <w:trPr>
+          <w:tblHeader/>
+        </w:trPr>
+        <w:tc>
+          <w:tcPr>
+            <w:tcW w:type="dxa" w:w="3126"/>
+            <w:tcBorders>
+              <w:top w:val="single" w:color="B9C8C4" w:sz="4"/>
+              <w:left w:val="single" w:color="B9C8C4" w:sz="4"/>
+              <w:bottom w:val="single" w:color="B9C8C4" w:sz="4"/>
+              <w:right w:val="single" w:color="B9C8C4" w:sz="4"/>
+            </w:tcBorders>
+            <w:shd w:fill="E8F0EE" w:color="auto" w:val="clear"/>
+            <w:tcMar>
+              <w:top w:type="dxa" w:w="60"/>
+              <w:left w:type="dxa" w:w="90"/>
+              <w:bottom w:type="dxa" w:w="60"/>
+              <w:right w:type="dxa" w:w="90"/>
+            </w:tcMar>
+          </w:tcPr>
+          <w:p>
+            <w:pPr>
+              <w:spacing w:after="0" w:line="260"/>
+            </w:pPr>
+            <w:r>
+              <w:rPr>
+                <w:b/>
+                <w:bCs/>
+                <w:sz w:val="18"/>
+                <w:szCs w:val="18"/>
+              </w:rPr>
+              <w:t xml:space="preserve">원인</w:t>
+            </w:r>
+          </w:p>
+        </w:tc>
+        <w:tc>
+          <w:tcPr>
+            <w:tcW w:type="dxa" w:w="1302"/>
+            <w:tcBorders>
+              <w:top w:val="single" w:color="B9C8C4" w:sz="4"/>
+              <w:left w:val="single" w:color="B9C8C4" w:sz="4"/>
+              <w:bottom w:val="single" w:color="B9C8C4" w:sz="4"/>
+              <w:right w:val="single" w:color="B9C8C4" w:sz="4"/>
+            </w:tcBorders>
+            <w:shd w:fill="E8F0EE" w:color="auto" w:val="clear"/>
+            <w:tcMar>
+              <w:top w:type="dxa" w:w="60"/>
+              <w:left w:type="dxa" w:w="90"/>
+              <w:bottom w:type="dxa" w:w="60"/>
+              <w:right w:type="dxa" w:w="90"/>
+            </w:tcMar>
+          </w:tcPr>
+          <w:p>
+            <w:pPr>
+              <w:spacing w:after="0" w:line="260"/>
+            </w:pPr>
+            <w:r>
+              <w:rPr>
+                <w:b/>
+                <w:bCs/>
+                <w:sz w:val="18"/>
+                <w:szCs w:val="18"/>
+              </w:rPr>
+              <w:t xml:space="preserve">C0</w:t>
+            </w:r>
+          </w:p>
+        </w:tc>
+        <w:tc>
+          <w:tcPr>
+            <w:tcW w:type="dxa" w:w="1302"/>
+            <w:tcBorders>
+              <w:top w:val="single" w:color="B9C8C4" w:sz="4"/>
+              <w:left w:val="single" w:color="B9C8C4" w:sz="4"/>
+              <w:bottom w:val="single" w:color="B9C8C4" w:sz="4"/>
+              <w:right w:val="single" w:color="B9C8C4" w:sz="4"/>
+            </w:tcBorders>
+            <w:shd w:fill="E8F0EE" w:color="auto" w:val="clear"/>
+            <w:tcMar>
+              <w:top w:type="dxa" w:w="60"/>
+              <w:left w:type="dxa" w:w="90"/>
+              <w:bottom w:type="dxa" w:w="60"/>
+              <w:right w:type="dxa" w:w="90"/>
+            </w:tcMar>
+          </w:tcPr>
+          <w:p>
+            <w:pPr>
+              <w:spacing w:after="0" w:line="260"/>
+            </w:pPr>
+            <w:r>
+              <w:rPr>
+                <w:b/>
+                <w:bCs/>
+                <w:sz w:val="18"/>
+                <w:szCs w:val="18"/>
+              </w:rPr>
+              <w:t xml:space="preserve">C1</w:t>
+            </w:r>
+          </w:p>
+        </w:tc>
+        <w:tc>
+          <w:tcPr>
+            <w:tcW w:type="dxa" w:w="1302"/>
+            <w:tcBorders>
+              <w:top w:val="single" w:color="B9C8C4" w:sz="4"/>
+              <w:left w:val="single" w:color="B9C8C4" w:sz="4"/>
+              <w:bottom w:val="single" w:color="B9C8C4" w:sz="4"/>
+              <w:right w:val="single" w:color="B9C8C4" w:sz="4"/>
+            </w:tcBorders>
+            <w:shd w:fill="E8F0EE" w:color="auto" w:val="clear"/>
+            <w:tcMar>
+              <w:top w:type="dxa" w:w="60"/>
+              <w:left w:type="dxa" w:w="90"/>
+              <w:bottom w:type="dxa" w:w="60"/>
+              <w:right w:type="dxa" w:w="90"/>
+            </w:tcMar>
+          </w:tcPr>
+          <w:p>
+            <w:pPr>
+              <w:spacing w:after="0" w:line="260"/>
+            </w:pPr>
+            <w:r>
+              <w:rPr>
+                <w:b/>
+                <w:bCs/>
+                <w:sz w:val="18"/>
+                <w:szCs w:val="18"/>
+              </w:rPr>
+              <w:t xml:space="preserve">C2</w:t>
+            </w:r>
+          </w:p>
+        </w:tc>
+        <w:tc>
+          <w:tcPr>
+            <w:tcW w:type="dxa" w:w="1302"/>
+            <w:tcBorders>
+              <w:top w:val="single" w:color="B9C8C4" w:sz="4"/>
+              <w:left w:val="single" w:color="B9C8C4" w:sz="4"/>
+              <w:bottom w:val="single" w:color="B9C8C4" w:sz="4"/>
+              <w:right w:val="single" w:color="B9C8C4" w:sz="4"/>
+            </w:tcBorders>
+            <w:shd w:fill="E8F0EE" w:color="auto" w:val="clear"/>
+            <w:tcMar>
+              <w:top w:type="dxa" w:w="60"/>
+              <w:left w:type="dxa" w:w="90"/>
+              <w:bottom w:type="dxa" w:w="60"/>
+              <w:right w:type="dxa" w:w="90"/>
+            </w:tcMar>
+          </w:tcPr>
+          <w:p>
+            <w:pPr>
+              <w:spacing w:after="0" w:line="260"/>
+            </w:pPr>
+            <w:r>
+              <w:rPr>
+                <w:b/>
+                <w:bCs/>
+                <w:sz w:val="18"/>
+                <w:szCs w:val="18"/>
+              </w:rPr>
+              <w:t xml:space="preserve">C3</w:t>
+            </w:r>
+          </w:p>
+        </w:tc>
+        <w:tc>
+          <w:tcPr>
+            <w:tcW w:type="dxa" w:w="1304"/>
+            <w:tcBorders>
+              <w:top w:val="single" w:color="B9C8C4" w:sz="4"/>
+              <w:left w:val="single" w:color="B9C8C4" w:sz="4"/>
+              <w:bottom w:val="single" w:color="B9C8C4" w:sz="4"/>
+              <w:right w:val="single" w:color="B9C8C4" w:sz="4"/>
+            </w:tcBorders>
+            <w:shd w:fill="E8F0EE" w:color="auto" w:val="clear"/>
+            <w:tcMar>
+              <w:top w:type="dxa" w:w="60"/>
+              <w:left w:type="dxa" w:w="90"/>
+              <w:bottom w:type="dxa" w:w="60"/>
+              <w:right w:type="dxa" w:w="90"/>
+            </w:tcMar>
+          </w:tcPr>
+          <w:p>
+            <w:pPr>
+              <w:spacing w:after="0" w:line="260"/>
+            </w:pPr>
+            <w:r>
+              <w:rPr>
+                <w:b/>
+                <w:bCs/>
+                <w:sz w:val="18"/>
+                <w:szCs w:val="18"/>
+              </w:rPr>
+              <w:t xml:space="preserve">C4</w:t>
+            </w:r>
+          </w:p>
+        </w:tc>
+      </w:tr>
+      <w:tr>
+        <w:tc>
+          <w:tcPr>
+            <w:tcW w:type="dxa" w:w="3126"/>
+            <w:tcBorders>
+              <w:top w:val="single" w:color="B9C8C4" w:sz="4"/>
+              <w:left w:val="single" w:color="B9C8C4" w:sz="4"/>
+              <w:bottom w:val="single" w:color="B9C8C4" w:sz="4"/>
+              <w:right w:val="single" w:color="B9C8C4" w:sz="4"/>
+            </w:tcBorders>
+            <w:tcMar>
+              <w:top w:type="dxa" w:w="60"/>
+              <w:left w:type="dxa" w:w="90"/>
+              <w:bottom w:type="dxa" w:w="60"/>
+              <w:right w:type="dxa" w:w="90"/>
+            </w:tcMar>
+          </w:tcPr>
+          <w:p>
+            <w:pPr>
+              <w:spacing w:after="0" w:line="260"/>
+            </w:pPr>
+            <w:r>
+              <w:rPr>
+                <w:b w:val="false"/>
+                <w:bCs w:val="false"/>
+                <w:sz w:val="18"/>
+                <w:szCs w:val="18"/>
+              </w:rPr>
+              <w:t xml:space="preserve">저산소성 간염</w:t>
+            </w:r>
+          </w:p>
+        </w:tc>
+        <w:tc>
+          <w:tcPr>
+            <w:tcW w:type="dxa" w:w="1302"/>
+            <w:tcBorders>
+              <w:top w:val="single" w:color="B9C8C4" w:sz="4"/>
+              <w:left w:val="single" w:color="B9C8C4" w:sz="4"/>
+              <w:bottom w:val="single" w:color="B9C8C4" w:sz="4"/>
+              <w:right w:val="single" w:color="B9C8C4" w:sz="4"/>
+            </w:tcBorders>
+            <w:tcMar>
+              <w:top w:type="dxa" w:w="60"/>
+              <w:left w:type="dxa" w:w="90"/>
+              <w:bottom w:type="dxa" w:w="60"/>
+              <w:right w:type="dxa" w:w="90"/>
+            </w:tcMar>
+          </w:tcPr>
+          <w:p>
+            <w:pPr>
+              <w:spacing w:after="0" w:line="260"/>
+            </w:pPr>
+            <w:r>
+              <w:rPr>
+                <w:b w:val="false"/>
+                <w:bCs w:val="false"/>
+                <w:sz w:val="18"/>
+                <w:szCs w:val="18"/>
+              </w:rPr>
+              <w:t xml:space="preserve">59%</w:t>
+            </w:r>
+          </w:p>
+        </w:tc>
+        <w:tc>
+          <w:tcPr>
+            <w:tcW w:type="dxa" w:w="1302"/>
+            <w:tcBorders>
+              <w:top w:val="single" w:color="B9C8C4" w:sz="4"/>
+              <w:left w:val="single" w:color="B9C8C4" w:sz="4"/>
+              <w:bottom w:val="single" w:color="B9C8C4" w:sz="4"/>
+              <w:right w:val="single" w:color="B9C8C4" w:sz="4"/>
+            </w:tcBorders>
+            <w:tcMar>
+              <w:top w:type="dxa" w:w="60"/>
+              <w:left w:type="dxa" w:w="90"/>
+              <w:bottom w:type="dxa" w:w="60"/>
+              <w:right w:type="dxa" w:w="90"/>
+            </w:tcMar>
+          </w:tcPr>
+          <w:p>
+            <w:pPr>
+              <w:spacing w:after="0" w:line="260"/>
+            </w:pPr>
+            <w:r>
+              <w:rPr>
+                <w:b w:val="false"/>
+                <w:bCs w:val="false"/>
+                <w:sz w:val="18"/>
+                <w:szCs w:val="18"/>
+              </w:rPr>
+              <w:t xml:space="preserve">33%</w:t>
+            </w:r>
+          </w:p>
+        </w:tc>
+        <w:tc>
+          <w:tcPr>
+            <w:tcW w:type="dxa" w:w="1302"/>
+            <w:tcBorders>
+              <w:top w:val="single" w:color="B9C8C4" w:sz="4"/>
+              <w:left w:val="single" w:color="B9C8C4" w:sz="4"/>
+              <w:bottom w:val="single" w:color="B9C8C4" w:sz="4"/>
+              <w:right w:val="single" w:color="B9C8C4" w:sz="4"/>
+            </w:tcBorders>
+            <w:tcMar>
+              <w:top w:type="dxa" w:w="60"/>
+              <w:left w:type="dxa" w:w="90"/>
+              <w:bottom w:type="dxa" w:w="60"/>
+              <w:right w:type="dxa" w:w="90"/>
+            </w:tcMar>
+          </w:tcPr>
+          <w:p>
+            <w:pPr>
+              <w:spacing w:after="0" w:line="260"/>
+            </w:pPr>
+            <w:r>
+              <w:rPr>
+                <w:b w:val="false"/>
+                <w:bCs w:val="false"/>
+                <w:sz w:val="18"/>
+                <w:szCs w:val="18"/>
+              </w:rPr>
+              <w:t xml:space="preserve">28%</w:t>
+            </w:r>
+          </w:p>
+        </w:tc>
+        <w:tc>
+          <w:tcPr>
+            <w:tcW w:type="dxa" w:w="1302"/>
+            <w:tcBorders>
+              <w:top w:val="single" w:color="B9C8C4" w:sz="4"/>
+              <w:left w:val="single" w:color="B9C8C4" w:sz="4"/>
+              <w:bottom w:val="single" w:color="B9C8C4" w:sz="4"/>
+              <w:right w:val="single" w:color="B9C8C4" w:sz="4"/>
+            </w:tcBorders>
+            <w:tcMar>
+              <w:top w:type="dxa" w:w="60"/>
+              <w:left w:type="dxa" w:w="90"/>
+              <w:bottom w:type="dxa" w:w="60"/>
+              <w:right w:type="dxa" w:w="90"/>
+            </w:tcMar>
+          </w:tcPr>
+          <w:p>
+            <w:pPr>
+              <w:spacing w:after="0" w:line="260"/>
+            </w:pPr>
+            <w:r>
+              <w:rPr>
+                <w:b w:val="false"/>
+                <w:bCs w:val="false"/>
+                <w:sz w:val="18"/>
+                <w:szCs w:val="18"/>
+              </w:rPr>
+              <w:t xml:space="preserve">40%</w:t>
+            </w:r>
+          </w:p>
+        </w:tc>
+        <w:tc>
+          <w:tcPr>
+            <w:tcW w:type="dxa" w:w="1304"/>
+            <w:tcBorders>
+              <w:top w:val="single" w:color="B9C8C4" w:sz="4"/>
+              <w:left w:val="single" w:color="B9C8C4" w:sz="4"/>
+              <w:bottom w:val="single" w:color="B9C8C4" w:sz="4"/>
+              <w:right w:val="single" w:color="B9C8C4" w:sz="4"/>
+            </w:tcBorders>
+            <w:tcMar>
+              <w:top w:type="dxa" w:w="60"/>
+              <w:left w:type="dxa" w:w="90"/>
+              <w:bottom w:type="dxa" w:w="60"/>
+              <w:right w:type="dxa" w:w="90"/>
+            </w:tcMar>
+          </w:tcPr>
+          <w:p>
+            <w:pPr>
+              <w:spacing w:after="0" w:line="260"/>
+            </w:pPr>
+            <w:r>
+              <w:rPr>
+                <w:b w:val="false"/>
+                <w:bCs w:val="false"/>
+                <w:sz w:val="18"/>
+                <w:szCs w:val="18"/>
+              </w:rPr>
+              <w:t xml:space="preserve">34%</w:t>
+            </w:r>
+          </w:p>
+        </w:tc>
+      </w:tr>
+      <w:tr>
+        <w:tc>
+          <w:tcPr>
+            <w:tcW w:type="dxa" w:w="3126"/>
+            <w:tcBorders>
+              <w:top w:val="single" w:color="B9C8C4" w:sz="4"/>
+              <w:left w:val="single" w:color="B9C8C4" w:sz="4"/>
+              <w:bottom w:val="single" w:color="B9C8C4" w:sz="4"/>
+              <w:right w:val="single" w:color="B9C8C4" w:sz="4"/>
+            </w:tcBorders>
+            <w:tcMar>
+              <w:top w:type="dxa" w:w="60"/>
+              <w:left w:type="dxa" w:w="90"/>
+              <w:bottom w:type="dxa" w:w="60"/>
+              <w:right w:type="dxa" w:w="90"/>
+            </w:tcMar>
+          </w:tcPr>
+          <w:p>
+            <w:pPr>
+              <w:spacing w:after="0" w:line="260"/>
+            </w:pPr>
+            <w:r>
+              <w:rPr>
+                <w:b w:val="false"/>
+                <w:bCs w:val="false"/>
+                <w:sz w:val="18"/>
+                <w:szCs w:val="18"/>
+              </w:rPr>
+              <w:t xml:space="preserve">울혈성 간병증</w:t>
+            </w:r>
+          </w:p>
+        </w:tc>
+        <w:tc>
+          <w:tcPr>
+            <w:tcW w:type="dxa" w:w="1302"/>
+            <w:tcBorders>
+              <w:top w:val="single" w:color="B9C8C4" w:sz="4"/>
+              <w:left w:val="single" w:color="B9C8C4" w:sz="4"/>
+              <w:bottom w:val="single" w:color="B9C8C4" w:sz="4"/>
+              <w:right w:val="single" w:color="B9C8C4" w:sz="4"/>
+            </w:tcBorders>
+            <w:tcMar>
+              <w:top w:type="dxa" w:w="60"/>
+              <w:left w:type="dxa" w:w="90"/>
+              <w:bottom w:type="dxa" w:w="60"/>
+              <w:right w:type="dxa" w:w="90"/>
+            </w:tcMar>
+          </w:tcPr>
+          <w:p>
+            <w:pPr>
+              <w:spacing w:after="0" w:line="260"/>
+            </w:pPr>
+            <w:r>
+              <w:rPr>
+                <w:b w:val="false"/>
+                <w:bCs w:val="false"/>
+                <w:sz w:val="18"/>
+                <w:szCs w:val="18"/>
+              </w:rPr>
+              <w:t xml:space="preserve">34%</w:t>
+            </w:r>
+          </w:p>
+        </w:tc>
+        <w:tc>
+          <w:tcPr>
+            <w:tcW w:type="dxa" w:w="1302"/>
+            <w:tcBorders>
+              <w:top w:val="single" w:color="B9C8C4" w:sz="4"/>
+              <w:left w:val="single" w:color="B9C8C4" w:sz="4"/>
+              <w:bottom w:val="single" w:color="B9C8C4" w:sz="4"/>
+              <w:right w:val="single" w:color="B9C8C4" w:sz="4"/>
+            </w:tcBorders>
+            <w:tcMar>
+              <w:top w:type="dxa" w:w="60"/>
+              <w:left w:type="dxa" w:w="90"/>
+              <w:bottom w:type="dxa" w:w="60"/>
+              <w:right w:type="dxa" w:w="90"/>
+            </w:tcMar>
+          </w:tcPr>
+          <w:p>
+            <w:pPr>
+              <w:spacing w:after="0" w:line="260"/>
+            </w:pPr>
+            <w:r>
+              <w:rPr>
+                <w:b w:val="false"/>
+                <w:bCs w:val="false"/>
+                <w:sz w:val="18"/>
+                <w:szCs w:val="18"/>
+              </w:rPr>
+              <w:t xml:space="preserve">29%</w:t>
+            </w:r>
+          </w:p>
+        </w:tc>
+        <w:tc>
+          <w:tcPr>
+            <w:tcW w:type="dxa" w:w="1302"/>
+            <w:tcBorders>
+              <w:top w:val="single" w:color="B9C8C4" w:sz="4"/>
+              <w:left w:val="single" w:color="B9C8C4" w:sz="4"/>
+              <w:bottom w:val="single" w:color="B9C8C4" w:sz="4"/>
+              <w:right w:val="single" w:color="B9C8C4" w:sz="4"/>
+            </w:tcBorders>
+            <w:tcMar>
+              <w:top w:type="dxa" w:w="60"/>
+              <w:left w:type="dxa" w:w="90"/>
+              <w:bottom w:type="dxa" w:w="60"/>
+              <w:right w:type="dxa" w:w="90"/>
+            </w:tcMar>
+          </w:tcPr>
+          <w:p>
+            <w:pPr>
+              <w:spacing w:after="0" w:line="260"/>
+            </w:pPr>
+            <w:r>
+              <w:rPr>
+                <w:b w:val="false"/>
+                <w:bCs w:val="false"/>
+                <w:sz w:val="18"/>
+                <w:szCs w:val="18"/>
+              </w:rPr>
+              <w:t xml:space="preserve">30%</w:t>
+            </w:r>
+          </w:p>
+        </w:tc>
+        <w:tc>
+          <w:tcPr>
+            <w:tcW w:type="dxa" w:w="1302"/>
+            <w:tcBorders>
+              <w:top w:val="single" w:color="B9C8C4" w:sz="4"/>
+              <w:left w:val="single" w:color="B9C8C4" w:sz="4"/>
+              <w:bottom w:val="single" w:color="B9C8C4" w:sz="4"/>
+              <w:right w:val="single" w:color="B9C8C4" w:sz="4"/>
+            </w:tcBorders>
+            <w:tcMar>
+              <w:top w:type="dxa" w:w="60"/>
+              <w:left w:type="dxa" w:w="90"/>
+              <w:bottom w:type="dxa" w:w="60"/>
+              <w:right w:type="dxa" w:w="90"/>
+            </w:tcMar>
+          </w:tcPr>
+          <w:p>
+            <w:pPr>
+              <w:spacing w:after="0" w:line="260"/>
+            </w:pPr>
+            <w:r>
+              <w:rPr>
+                <w:b w:val="false"/>
+                <w:bCs w:val="false"/>
+                <w:sz w:val="18"/>
+                <w:szCs w:val="18"/>
+              </w:rPr>
+              <w:t xml:space="preserve">21%</w:t>
+            </w:r>
+          </w:p>
+        </w:tc>
+        <w:tc>
+          <w:tcPr>
+            <w:tcW w:type="dxa" w:w="1304"/>
+            <w:tcBorders>
+              <w:top w:val="single" w:color="B9C8C4" w:sz="4"/>
+              <w:left w:val="single" w:color="B9C8C4" w:sz="4"/>
+              <w:bottom w:val="single" w:color="B9C8C4" w:sz="4"/>
+              <w:right w:val="single" w:color="B9C8C4" w:sz="4"/>
+            </w:tcBorders>
+            <w:tcMar>
+              <w:top w:type="dxa" w:w="60"/>
+              <w:left w:type="dxa" w:w="90"/>
+              <w:bottom w:type="dxa" w:w="60"/>
+              <w:right w:type="dxa" w:w="90"/>
+            </w:tcMar>
+          </w:tcPr>
+          <w:p>
+            <w:pPr>
+              <w:spacing w:after="0" w:line="260"/>
+            </w:pPr>
+            <w:r>
+              <w:rPr>
+                <w:b w:val="false"/>
+                <w:bCs w:val="false"/>
+                <w:sz w:val="18"/>
+                <w:szCs w:val="18"/>
+              </w:rPr>
+              <w:t xml:space="preserve">22%</w:t>
+            </w:r>
+          </w:p>
+        </w:tc>
+      </w:tr>
+      <w:tr>
+        <w:tc>
+          <w:tcPr>
+            <w:tcW w:type="dxa" w:w="3126"/>
+            <w:tcBorders>
+              <w:top w:val="single" w:color="B9C8C4" w:sz="4"/>
+              <w:left w:val="single" w:color="B9C8C4" w:sz="4"/>
+              <w:bottom w:val="single" w:color="B9C8C4" w:sz="4"/>
+              <w:right w:val="single" w:color="B9C8C4" w:sz="4"/>
+            </w:tcBorders>
+            <w:tcMar>
+              <w:top w:type="dxa" w:w="60"/>
+              <w:left w:type="dxa" w:w="90"/>
+              <w:bottom w:type="dxa" w:w="60"/>
+              <w:right w:type="dxa" w:w="90"/>
+            </w:tcMar>
+          </w:tcPr>
+          <w:p>
+            <w:pPr>
+              <w:spacing w:after="0" w:line="260"/>
+            </w:pPr>
+            <w:r>
+              <w:rPr>
+                <w:b w:val="false"/>
+                <w:bCs w:val="false"/>
+                <w:sz w:val="18"/>
+                <w:szCs w:val="18"/>
+              </w:rPr>
+              <w:t xml:space="preserve">패혈증 담즙정체</w:t>
+            </w:r>
+          </w:p>
+        </w:tc>
+        <w:tc>
+          <w:tcPr>
+            <w:tcW w:type="dxa" w:w="1302"/>
+            <w:tcBorders>
+              <w:top w:val="single" w:color="B9C8C4" w:sz="4"/>
+              <w:left w:val="single" w:color="B9C8C4" w:sz="4"/>
+              <w:bottom w:val="single" w:color="B9C8C4" w:sz="4"/>
+              <w:right w:val="single" w:color="B9C8C4" w:sz="4"/>
+            </w:tcBorders>
+            <w:tcMar>
+              <w:top w:type="dxa" w:w="60"/>
+              <w:left w:type="dxa" w:w="90"/>
+              <w:bottom w:type="dxa" w:w="60"/>
+              <w:right w:type="dxa" w:w="90"/>
+            </w:tcMar>
+          </w:tcPr>
+          <w:p>
+            <w:pPr>
+              <w:spacing w:after="0" w:line="260"/>
+            </w:pPr>
+            <w:r>
+              <w:rPr>
+                <w:b w:val="false"/>
+                <w:bCs w:val="false"/>
+                <w:sz w:val="18"/>
+                <w:szCs w:val="18"/>
+              </w:rPr>
+              <w:t xml:space="preserve">29%</w:t>
+            </w:r>
+          </w:p>
+        </w:tc>
+        <w:tc>
+          <w:tcPr>
+            <w:tcW w:type="dxa" w:w="1302"/>
+            <w:tcBorders>
+              <w:top w:val="single" w:color="B9C8C4" w:sz="4"/>
+              <w:left w:val="single" w:color="B9C8C4" w:sz="4"/>
+              <w:bottom w:val="single" w:color="B9C8C4" w:sz="4"/>
+              <w:right w:val="single" w:color="B9C8C4" w:sz="4"/>
+            </w:tcBorders>
+            <w:tcMar>
+              <w:top w:type="dxa" w:w="60"/>
+              <w:left w:type="dxa" w:w="90"/>
+              <w:bottom w:type="dxa" w:w="60"/>
+              <w:right w:type="dxa" w:w="90"/>
+            </w:tcMar>
+          </w:tcPr>
+          <w:p>
+            <w:pPr>
+              <w:spacing w:after="0" w:line="260"/>
+            </w:pPr>
+            <w:r>
+              <w:rPr>
+                <w:b w:val="false"/>
+                <w:bCs w:val="false"/>
+                <w:sz w:val="18"/>
+                <w:szCs w:val="18"/>
+              </w:rPr>
+              <w:t xml:space="preserve">27%</w:t>
+            </w:r>
+          </w:p>
+        </w:tc>
+        <w:tc>
+          <w:tcPr>
+            <w:tcW w:type="dxa" w:w="1302"/>
+            <w:tcBorders>
+              <w:top w:val="single" w:color="B9C8C4" w:sz="4"/>
+              <w:left w:val="single" w:color="B9C8C4" w:sz="4"/>
+              <w:bottom w:val="single" w:color="B9C8C4" w:sz="4"/>
+              <w:right w:val="single" w:color="B9C8C4" w:sz="4"/>
+            </w:tcBorders>
+            <w:tcMar>
+              <w:top w:type="dxa" w:w="60"/>
+              <w:left w:type="dxa" w:w="90"/>
+              <w:bottom w:type="dxa" w:w="60"/>
+              <w:right w:type="dxa" w:w="90"/>
+            </w:tcMar>
+          </w:tcPr>
+          <w:p>
+            <w:pPr>
+              <w:spacing w:after="0" w:line="260"/>
+            </w:pPr>
+            <w:r>
+              <w:rPr>
+                <w:b w:val="false"/>
+                <w:bCs w:val="false"/>
+                <w:sz w:val="18"/>
+                <w:szCs w:val="18"/>
+              </w:rPr>
+              <w:t xml:space="preserve">44%</w:t>
+            </w:r>
+          </w:p>
+        </w:tc>
+        <w:tc>
+          <w:tcPr>
+            <w:tcW w:type="dxa" w:w="1302"/>
+            <w:tcBorders>
+              <w:top w:val="single" w:color="B9C8C4" w:sz="4"/>
+              <w:left w:val="single" w:color="B9C8C4" w:sz="4"/>
+              <w:bottom w:val="single" w:color="B9C8C4" w:sz="4"/>
+              <w:right w:val="single" w:color="B9C8C4" w:sz="4"/>
+            </w:tcBorders>
+            <w:tcMar>
+              <w:top w:type="dxa" w:w="60"/>
+              <w:left w:type="dxa" w:w="90"/>
+              <w:bottom w:type="dxa" w:w="60"/>
+              <w:right w:type="dxa" w:w="90"/>
+            </w:tcMar>
+          </w:tcPr>
+          <w:p>
+            <w:pPr>
+              <w:spacing w:after="0" w:line="260"/>
+            </w:pPr>
+            <w:r>
+              <w:rPr>
+                <w:b w:val="false"/>
+                <w:bCs w:val="false"/>
+                <w:sz w:val="18"/>
+                <w:szCs w:val="18"/>
+              </w:rPr>
+              <w:t xml:space="preserve">49%</w:t>
+            </w:r>
+          </w:p>
+        </w:tc>
+        <w:tc>
+          <w:tcPr>
+            <w:tcW w:type="dxa" w:w="1304"/>
+            <w:tcBorders>
+              <w:top w:val="single" w:color="B9C8C4" w:sz="4"/>
+              <w:left w:val="single" w:color="B9C8C4" w:sz="4"/>
+              <w:bottom w:val="single" w:color="B9C8C4" w:sz="4"/>
+              <w:right w:val="single" w:color="B9C8C4" w:sz="4"/>
+            </w:tcBorders>
+            <w:tcMar>
+              <w:top w:type="dxa" w:w="60"/>
+              <w:left w:type="dxa" w:w="90"/>
+              <w:bottom w:type="dxa" w:w="60"/>
+              <w:right w:type="dxa" w:w="90"/>
+            </w:tcMar>
+          </w:tcPr>
+          <w:p>
+            <w:pPr>
+              <w:spacing w:after="0" w:line="260"/>
+            </w:pPr>
+            <w:r>
+              <w:rPr>
+                <w:b w:val="false"/>
+                <w:bCs w:val="false"/>
+                <w:sz w:val="18"/>
+                <w:szCs w:val="18"/>
+              </w:rPr>
+              <w:t xml:space="preserve">37%</w:t>
+            </w:r>
+          </w:p>
+        </w:tc>
+      </w:tr>
+      <w:tr>
+        <w:tc>
+          <w:tcPr>
+            <w:tcW w:type="dxa" w:w="3126"/>
+            <w:tcBorders>
+              <w:top w:val="single" w:color="B9C8C4" w:sz="4"/>
+              <w:left w:val="single" w:color="B9C8C4" w:sz="4"/>
+              <w:bottom w:val="single" w:color="B9C8C4" w:sz="4"/>
+              <w:right w:val="single" w:color="B9C8C4" w:sz="4"/>
+            </w:tcBorders>
+            <w:tcMar>
+              <w:top w:type="dxa" w:w="60"/>
+              <w:left w:type="dxa" w:w="90"/>
+              <w:bottom w:type="dxa" w:w="60"/>
+              <w:right w:type="dxa" w:w="90"/>
+            </w:tcMar>
+          </w:tcPr>
+          <w:p>
+            <w:pPr>
+              <w:spacing w:after="0" w:line="260"/>
+            </w:pPr>
+            <w:r>
+              <w:rPr>
+                <w:b w:val="false"/>
+                <w:bCs w:val="false"/>
+                <w:sz w:val="18"/>
+                <w:szCs w:val="18"/>
+              </w:rPr>
+              <w:t xml:space="preserve">DILI</w:t>
+            </w:r>
+          </w:p>
+        </w:tc>
+        <w:tc>
+          <w:tcPr>
+            <w:tcW w:type="dxa" w:w="1302"/>
+            <w:tcBorders>
+              <w:top w:val="single" w:color="B9C8C4" w:sz="4"/>
+              <w:left w:val="single" w:color="B9C8C4" w:sz="4"/>
+              <w:bottom w:val="single" w:color="B9C8C4" w:sz="4"/>
+              <w:right w:val="single" w:color="B9C8C4" w:sz="4"/>
+            </w:tcBorders>
+            <w:tcMar>
+              <w:top w:type="dxa" w:w="60"/>
+              <w:left w:type="dxa" w:w="90"/>
+              <w:bottom w:type="dxa" w:w="60"/>
+              <w:right w:type="dxa" w:w="90"/>
+            </w:tcMar>
+          </w:tcPr>
+          <w:p>
+            <w:pPr>
+              <w:spacing w:after="0" w:line="260"/>
+            </w:pPr>
+            <w:r>
+              <w:rPr>
+                <w:b w:val="false"/>
+                <w:bCs w:val="false"/>
+                <w:sz w:val="18"/>
+                <w:szCs w:val="18"/>
+              </w:rPr>
+              <w:t xml:space="preserve">23%</w:t>
+            </w:r>
+          </w:p>
+        </w:tc>
+        <w:tc>
+          <w:tcPr>
+            <w:tcW w:type="dxa" w:w="1302"/>
+            <w:tcBorders>
+              <w:top w:val="single" w:color="B9C8C4" w:sz="4"/>
+              <w:left w:val="single" w:color="B9C8C4" w:sz="4"/>
+              <w:bottom w:val="single" w:color="B9C8C4" w:sz="4"/>
+              <w:right w:val="single" w:color="B9C8C4" w:sz="4"/>
+            </w:tcBorders>
+            <w:tcMar>
+              <w:top w:type="dxa" w:w="60"/>
+              <w:left w:type="dxa" w:w="90"/>
+              <w:bottom w:type="dxa" w:w="60"/>
+              <w:right w:type="dxa" w:w="90"/>
+            </w:tcMar>
+          </w:tcPr>
+          <w:p>
+            <w:pPr>
+              <w:spacing w:after="0" w:line="260"/>
+            </w:pPr>
+            <w:r>
+              <w:rPr>
+                <w:b w:val="false"/>
+                <w:bCs w:val="false"/>
+                <w:sz w:val="18"/>
+                <w:szCs w:val="18"/>
+              </w:rPr>
+              <w:t xml:space="preserve">23%</w:t>
+            </w:r>
+          </w:p>
+        </w:tc>
+        <w:tc>
+          <w:tcPr>
+            <w:tcW w:type="dxa" w:w="1302"/>
+            <w:tcBorders>
+              <w:top w:val="single" w:color="B9C8C4" w:sz="4"/>
+              <w:left w:val="single" w:color="B9C8C4" w:sz="4"/>
+              <w:bottom w:val="single" w:color="B9C8C4" w:sz="4"/>
+              <w:right w:val="single" w:color="B9C8C4" w:sz="4"/>
+            </w:tcBorders>
+            <w:tcMar>
+              <w:top w:type="dxa" w:w="60"/>
+              <w:left w:type="dxa" w:w="90"/>
+              <w:bottom w:type="dxa" w:w="60"/>
+              <w:right w:type="dxa" w:w="90"/>
+            </w:tcMar>
+          </w:tcPr>
+          <w:p>
+            <w:pPr>
+              <w:spacing w:after="0" w:line="260"/>
+            </w:pPr>
+            <w:r>
+              <w:rPr>
+                <w:b w:val="false"/>
+                <w:bCs w:val="false"/>
+                <w:sz w:val="18"/>
+                <w:szCs w:val="18"/>
+              </w:rPr>
+              <w:t xml:space="preserve">24%</w:t>
+            </w:r>
+          </w:p>
+        </w:tc>
+        <w:tc>
+          <w:tcPr>
+            <w:tcW w:type="dxa" w:w="1302"/>
+            <w:tcBorders>
+              <w:top w:val="single" w:color="B9C8C4" w:sz="4"/>
+              <w:left w:val="single" w:color="B9C8C4" w:sz="4"/>
+              <w:bottom w:val="single" w:color="B9C8C4" w:sz="4"/>
+              <w:right w:val="single" w:color="B9C8C4" w:sz="4"/>
+            </w:tcBorders>
+            <w:tcMar>
+              <w:top w:type="dxa" w:w="60"/>
+              <w:left w:type="dxa" w:w="90"/>
+              <w:bottom w:type="dxa" w:w="60"/>
+              <w:right w:type="dxa" w:w="90"/>
+            </w:tcMar>
+          </w:tcPr>
+          <w:p>
+            <w:pPr>
+              <w:spacing w:after="0" w:line="260"/>
+            </w:pPr>
+            <w:r>
+              <w:rPr>
+                <w:b w:val="false"/>
+                <w:bCs w:val="false"/>
+                <w:sz w:val="18"/>
+                <w:szCs w:val="18"/>
+              </w:rPr>
+              <w:t xml:space="preserve">18%</w:t>
+            </w:r>
+          </w:p>
+        </w:tc>
+        <w:tc>
+          <w:tcPr>
+            <w:tcW w:type="dxa" w:w="1304"/>
+            <w:tcBorders>
+              <w:top w:val="single" w:color="B9C8C4" w:sz="4"/>
+              <w:left w:val="single" w:color="B9C8C4" w:sz="4"/>
+              <w:bottom w:val="single" w:color="B9C8C4" w:sz="4"/>
+              <w:right w:val="single" w:color="B9C8C4" w:sz="4"/>
+            </w:tcBorders>
+            <w:tcMar>
+              <w:top w:type="dxa" w:w="60"/>
+              <w:left w:type="dxa" w:w="90"/>
+              <w:bottom w:type="dxa" w:w="60"/>
+              <w:right w:type="dxa" w:w="90"/>
+            </w:tcMar>
+          </w:tcPr>
+          <w:p>
+            <w:pPr>
+              <w:spacing w:after="0" w:line="260"/>
+            </w:pPr>
+            <w:r>
+              <w:rPr>
+                <w:b w:val="false"/>
+                <w:bCs w:val="false"/>
+                <w:sz w:val="18"/>
+                <w:szCs w:val="18"/>
+              </w:rPr>
+              <w:t xml:space="preserve">19%</w:t>
+            </w:r>
+          </w:p>
+        </w:tc>
+      </w:tr>
+      <w:tr>
+        <w:tc>
+          <w:tcPr>
+            <w:tcW w:type="dxa" w:w="3126"/>
+            <w:tcBorders>
+              <w:top w:val="single" w:color="B9C8C4" w:sz="4"/>
+              <w:left w:val="single" w:color="B9C8C4" w:sz="4"/>
+              <w:bottom w:val="single" w:color="B9C8C4" w:sz="4"/>
+              <w:right w:val="single" w:color="B9C8C4" w:sz="4"/>
+            </w:tcBorders>
+            <w:tcMar>
+              <w:top w:type="dxa" w:w="60"/>
+              <w:left w:type="dxa" w:w="90"/>
+              <w:bottom w:type="dxa" w:w="60"/>
+              <w:right w:type="dxa" w:w="90"/>
+            </w:tcMar>
+          </w:tcPr>
+          <w:p>
+            <w:pPr>
+              <w:spacing w:after="0" w:line="260"/>
+            </w:pPr>
+            <w:r>
+              <w:rPr>
+                <w:b w:val="false"/>
+                <w:bCs w:val="false"/>
+                <w:sz w:val="18"/>
+                <w:szCs w:val="18"/>
+              </w:rPr>
+              <w:t xml:space="preserve">정맥영양 관련</w:t>
+            </w:r>
+          </w:p>
+        </w:tc>
+        <w:tc>
+          <w:tcPr>
+            <w:tcW w:type="dxa" w:w="1302"/>
+            <w:tcBorders>
+              <w:top w:val="single" w:color="B9C8C4" w:sz="4"/>
+              <w:left w:val="single" w:color="B9C8C4" w:sz="4"/>
+              <w:bottom w:val="single" w:color="B9C8C4" w:sz="4"/>
+              <w:right w:val="single" w:color="B9C8C4" w:sz="4"/>
+            </w:tcBorders>
+            <w:tcMar>
+              <w:top w:type="dxa" w:w="60"/>
+              <w:left w:type="dxa" w:w="90"/>
+              <w:bottom w:type="dxa" w:w="60"/>
+              <w:right w:type="dxa" w:w="90"/>
+            </w:tcMar>
+          </w:tcPr>
+          <w:p>
+            <w:pPr>
+              <w:spacing w:after="0" w:line="260"/>
+            </w:pPr>
+            <w:r>
+              <w:rPr>
+                <w:b w:val="false"/>
+                <w:bCs w:val="false"/>
+                <w:sz w:val="18"/>
+                <w:szCs w:val="18"/>
+              </w:rPr>
+              <w:t xml:space="preserve">0%</w:t>
+            </w:r>
+          </w:p>
+        </w:tc>
+        <w:tc>
+          <w:tcPr>
+            <w:tcW w:type="dxa" w:w="1302"/>
+            <w:tcBorders>
+              <w:top w:val="single" w:color="B9C8C4" w:sz="4"/>
+              <w:left w:val="single" w:color="B9C8C4" w:sz="4"/>
+              <w:bottom w:val="single" w:color="B9C8C4" w:sz="4"/>
+              <w:right w:val="single" w:color="B9C8C4" w:sz="4"/>
+            </w:tcBorders>
+            <w:tcMar>
+              <w:top w:type="dxa" w:w="60"/>
+              <w:left w:type="dxa" w:w="90"/>
+              <w:bottom w:type="dxa" w:w="60"/>
+              <w:right w:type="dxa" w:w="90"/>
+            </w:tcMar>
+          </w:tcPr>
+          <w:p>
+            <w:pPr>
+              <w:spacing w:after="0" w:line="260"/>
+            </w:pPr>
+            <w:r>
+              <w:rPr>
+                <w:b w:val="false"/>
+                <w:bCs w:val="false"/>
+                <w:sz w:val="18"/>
+                <w:szCs w:val="18"/>
+              </w:rPr>
+              <w:t xml:space="preserve">0%</w:t>
+            </w:r>
+          </w:p>
+        </w:tc>
+        <w:tc>
+          <w:tcPr>
+            <w:tcW w:type="dxa" w:w="1302"/>
+            <w:tcBorders>
+              <w:top w:val="single" w:color="B9C8C4" w:sz="4"/>
+              <w:left w:val="single" w:color="B9C8C4" w:sz="4"/>
+              <w:bottom w:val="single" w:color="B9C8C4" w:sz="4"/>
+              <w:right w:val="single" w:color="B9C8C4" w:sz="4"/>
+            </w:tcBorders>
+            <w:tcMar>
+              <w:top w:type="dxa" w:w="60"/>
+              <w:left w:type="dxa" w:w="90"/>
+              <w:bottom w:type="dxa" w:w="60"/>
+              <w:right w:type="dxa" w:w="90"/>
+            </w:tcMar>
+          </w:tcPr>
+          <w:p>
+            <w:pPr>
+              <w:spacing w:after="0" w:line="260"/>
+            </w:pPr>
+            <w:r>
+              <w:rPr>
+                <w:b w:val="false"/>
+                <w:bCs w:val="false"/>
+                <w:sz w:val="18"/>
+                <w:szCs w:val="18"/>
+              </w:rPr>
+              <w:t xml:space="preserve">0%</w:t>
+            </w:r>
+          </w:p>
+        </w:tc>
+        <w:tc>
+          <w:tcPr>
+            <w:tcW w:type="dxa" w:w="1302"/>
+            <w:tcBorders>
+              <w:top w:val="single" w:color="B9C8C4" w:sz="4"/>
+              <w:left w:val="single" w:color="B9C8C4" w:sz="4"/>
+              <w:bottom w:val="single" w:color="B9C8C4" w:sz="4"/>
+              <w:right w:val="single" w:color="B9C8C4" w:sz="4"/>
+            </w:tcBorders>
+            <w:tcMar>
+              <w:top w:type="dxa" w:w="60"/>
+              <w:left w:type="dxa" w:w="90"/>
+              <w:bottom w:type="dxa" w:w="60"/>
+              <w:right w:type="dxa" w:w="90"/>
+            </w:tcMar>
+          </w:tcPr>
+          <w:p>
+            <w:pPr>
+              <w:spacing w:after="0" w:line="260"/>
+            </w:pPr>
+            <w:r>
+              <w:rPr>
+                <w:b w:val="false"/>
+                <w:bCs w:val="false"/>
+                <w:sz w:val="18"/>
+                <w:szCs w:val="18"/>
+              </w:rPr>
+              <w:t xml:space="preserve">0%</w:t>
+            </w:r>
+          </w:p>
+        </w:tc>
+        <w:tc>
+          <w:tcPr>
+            <w:tcW w:type="dxa" w:w="1304"/>
+            <w:tcBorders>
+              <w:top w:val="single" w:color="B9C8C4" w:sz="4"/>
+              <w:left w:val="single" w:color="B9C8C4" w:sz="4"/>
+              <w:bottom w:val="single" w:color="B9C8C4" w:sz="4"/>
+              <w:right w:val="single" w:color="B9C8C4" w:sz="4"/>
+            </w:tcBorders>
+            <w:tcMar>
+              <w:top w:type="dxa" w:w="60"/>
+              <w:left w:type="dxa" w:w="90"/>
+              <w:bottom w:type="dxa" w:w="60"/>
+              <w:right w:type="dxa" w:w="90"/>
+            </w:tcMar>
+          </w:tcPr>
+          <w:p>
+            <w:pPr>
+              <w:spacing w:after="0" w:line="260"/>
+            </w:pPr>
+            <w:r>
+              <w:rPr>
+                <w:b w:val="false"/>
+                <w:bCs w:val="false"/>
+                <w:sz w:val="18"/>
+                <w:szCs w:val="18"/>
+              </w:rPr>
+              <w:t xml:space="preserve">0%</w:t>
+            </w:r>
+          </w:p>
+        </w:tc>
+      </w:tr>
+      <w:tr>
+        <w:tc>
+          <w:tcPr>
+            <w:tcW w:type="dxa" w:w="3126"/>
+            <w:tcBorders>
+              <w:top w:val="single" w:color="B9C8C4" w:sz="4"/>
+              <w:left w:val="single" w:color="B9C8C4" w:sz="4"/>
+              <w:bottom w:val="single" w:color="B9C8C4" w:sz="4"/>
+              <w:right w:val="single" w:color="B9C8C4" w:sz="4"/>
+            </w:tcBorders>
+            <w:tcMar>
+              <w:top w:type="dxa" w:w="60"/>
+              <w:left w:type="dxa" w:w="90"/>
+              <w:bottom w:type="dxa" w:w="60"/>
+              <w:right w:type="dxa" w:w="90"/>
+            </w:tcMar>
+          </w:tcPr>
+          <w:p>
+            <w:pPr>
+              <w:spacing w:after="0" w:line="260"/>
+            </w:pPr>
+            <w:r>
+              <w:rPr>
+                <w:b w:val="false"/>
+                <w:bCs w:val="false"/>
+                <w:sz w:val="18"/>
+                <w:szCs w:val="18"/>
+              </w:rPr>
+              <w:t xml:space="preserve">담도폐쇄·담관염</w:t>
+            </w:r>
+          </w:p>
+        </w:tc>
+        <w:tc>
+          <w:tcPr>
+            <w:tcW w:type="dxa" w:w="1302"/>
+            <w:tcBorders>
+              <w:top w:val="single" w:color="B9C8C4" w:sz="4"/>
+              <w:left w:val="single" w:color="B9C8C4" w:sz="4"/>
+              <w:bottom w:val="single" w:color="B9C8C4" w:sz="4"/>
+              <w:right w:val="single" w:color="B9C8C4" w:sz="4"/>
+            </w:tcBorders>
+            <w:tcMar>
+              <w:top w:type="dxa" w:w="60"/>
+              <w:left w:type="dxa" w:w="90"/>
+              <w:bottom w:type="dxa" w:w="60"/>
+              <w:right w:type="dxa" w:w="90"/>
+            </w:tcMar>
+          </w:tcPr>
+          <w:p>
+            <w:pPr>
+              <w:spacing w:after="0" w:line="260"/>
+            </w:pPr>
+            <w:r>
+              <w:rPr>
+                <w:b w:val="false"/>
+                <w:bCs w:val="false"/>
+                <w:sz w:val="18"/>
+                <w:szCs w:val="18"/>
+              </w:rPr>
+              <w:t xml:space="preserve">3%</w:t>
+            </w:r>
+          </w:p>
+        </w:tc>
+        <w:tc>
+          <w:tcPr>
+            <w:tcW w:type="dxa" w:w="1302"/>
+            <w:tcBorders>
+              <w:top w:val="single" w:color="B9C8C4" w:sz="4"/>
+              <w:left w:val="single" w:color="B9C8C4" w:sz="4"/>
+              <w:bottom w:val="single" w:color="B9C8C4" w:sz="4"/>
+              <w:right w:val="single" w:color="B9C8C4" w:sz="4"/>
+            </w:tcBorders>
+            <w:tcMar>
+              <w:top w:type="dxa" w:w="60"/>
+              <w:left w:type="dxa" w:w="90"/>
+              <w:bottom w:type="dxa" w:w="60"/>
+              <w:right w:type="dxa" w:w="90"/>
+            </w:tcMar>
+          </w:tcPr>
+          <w:p>
+            <w:pPr>
+              <w:spacing w:after="0" w:line="260"/>
+            </w:pPr>
+            <w:r>
+              <w:rPr>
+                <w:b w:val="false"/>
+                <w:bCs w:val="false"/>
+                <w:sz w:val="18"/>
+                <w:szCs w:val="18"/>
+              </w:rPr>
+              <w:t xml:space="preserve">3%</w:t>
+            </w:r>
+          </w:p>
+        </w:tc>
+        <w:tc>
+          <w:tcPr>
+            <w:tcW w:type="dxa" w:w="1302"/>
+            <w:tcBorders>
+              <w:top w:val="single" w:color="B9C8C4" w:sz="4"/>
+              <w:left w:val="single" w:color="B9C8C4" w:sz="4"/>
+              <w:bottom w:val="single" w:color="B9C8C4" w:sz="4"/>
+              <w:right w:val="single" w:color="B9C8C4" w:sz="4"/>
+            </w:tcBorders>
+            <w:tcMar>
+              <w:top w:type="dxa" w:w="60"/>
+              <w:left w:type="dxa" w:w="90"/>
+              <w:bottom w:type="dxa" w:w="60"/>
+              <w:right w:type="dxa" w:w="90"/>
+            </w:tcMar>
+          </w:tcPr>
+          <w:p>
+            <w:pPr>
+              <w:spacing w:after="0" w:line="260"/>
+            </w:pPr>
+            <w:r>
+              <w:rPr>
+                <w:b w:val="false"/>
+                <w:bCs w:val="false"/>
+                <w:sz w:val="18"/>
+                <w:szCs w:val="18"/>
+              </w:rPr>
+              <w:t xml:space="preserve">8%</w:t>
+            </w:r>
+          </w:p>
+        </w:tc>
+        <w:tc>
+          <w:tcPr>
+            <w:tcW w:type="dxa" w:w="1302"/>
+            <w:tcBorders>
+              <w:top w:val="single" w:color="B9C8C4" w:sz="4"/>
+              <w:left w:val="single" w:color="B9C8C4" w:sz="4"/>
+              <w:bottom w:val="single" w:color="B9C8C4" w:sz="4"/>
+              <w:right w:val="single" w:color="B9C8C4" w:sz="4"/>
+            </w:tcBorders>
+            <w:tcMar>
+              <w:top w:type="dxa" w:w="60"/>
+              <w:left w:type="dxa" w:w="90"/>
+              <w:bottom w:type="dxa" w:w="60"/>
+              <w:right w:type="dxa" w:w="90"/>
+            </w:tcMar>
+          </w:tcPr>
+          <w:p>
+            <w:pPr>
+              <w:spacing w:after="0" w:line="260"/>
+            </w:pPr>
+            <w:r>
+              <w:rPr>
+                <w:b w:val="false"/>
+                <w:bCs w:val="false"/>
+                <w:sz w:val="18"/>
+                <w:szCs w:val="18"/>
+              </w:rPr>
+              <w:t xml:space="preserve">30%</w:t>
+            </w:r>
+          </w:p>
+        </w:tc>
+        <w:tc>
+          <w:tcPr>
+            <w:tcW w:type="dxa" w:w="1304"/>
+            <w:tcBorders>
+              <w:top w:val="single" w:color="B9C8C4" w:sz="4"/>
+              <w:left w:val="single" w:color="B9C8C4" w:sz="4"/>
+              <w:bottom w:val="single" w:color="B9C8C4" w:sz="4"/>
+              <w:right w:val="single" w:color="B9C8C4" w:sz="4"/>
+            </w:tcBorders>
+            <w:tcMar>
+              <w:top w:type="dxa" w:w="60"/>
+              <w:left w:type="dxa" w:w="90"/>
+              <w:bottom w:type="dxa" w:w="60"/>
+              <w:right w:type="dxa" w:w="90"/>
+            </w:tcMar>
+          </w:tcPr>
+          <w:p>
+            <w:pPr>
+              <w:spacing w:after="0" w:line="260"/>
+            </w:pPr>
+            <w:r>
+              <w:rPr>
+                <w:b w:val="false"/>
+                <w:bCs w:val="false"/>
+                <w:sz w:val="18"/>
+                <w:szCs w:val="18"/>
+              </w:rPr>
+              <w:t xml:space="preserve">7%</w:t>
+            </w:r>
+          </w:p>
+        </w:tc>
+      </w:tr>
+      <w:tr>
+        <w:tc>
+          <w:tcPr>
+            <w:tcW w:type="dxa" w:w="3126"/>
+            <w:tcBorders>
+              <w:top w:val="single" w:color="B9C8C4" w:sz="4"/>
+              <w:left w:val="single" w:color="B9C8C4" w:sz="4"/>
+              <w:bottom w:val="single" w:color="B9C8C4" w:sz="4"/>
+              <w:right w:val="single" w:color="B9C8C4" w:sz="4"/>
+            </w:tcBorders>
+            <w:tcMar>
+              <w:top w:type="dxa" w:w="60"/>
+              <w:left w:type="dxa" w:w="90"/>
+              <w:bottom w:type="dxa" w:w="60"/>
+              <w:right w:type="dxa" w:w="90"/>
+            </w:tcMar>
+          </w:tcPr>
+          <w:p>
+            <w:pPr>
+              <w:spacing w:after="0" w:line="260"/>
+            </w:pPr>
+            <w:r>
+              <w:rPr>
+                <w:b w:val="false"/>
+                <w:bCs w:val="false"/>
+                <w:sz w:val="18"/>
+                <w:szCs w:val="18"/>
+              </w:rPr>
+              <w:t xml:space="preserve">담낭염</w:t>
+            </w:r>
+          </w:p>
+        </w:tc>
+        <w:tc>
+          <w:tcPr>
+            <w:tcW w:type="dxa" w:w="1302"/>
+            <w:tcBorders>
+              <w:top w:val="single" w:color="B9C8C4" w:sz="4"/>
+              <w:left w:val="single" w:color="B9C8C4" w:sz="4"/>
+              <w:bottom w:val="single" w:color="B9C8C4" w:sz="4"/>
+              <w:right w:val="single" w:color="B9C8C4" w:sz="4"/>
+            </w:tcBorders>
+            <w:tcMar>
+              <w:top w:type="dxa" w:w="60"/>
+              <w:left w:type="dxa" w:w="90"/>
+              <w:bottom w:type="dxa" w:w="60"/>
+              <w:right w:type="dxa" w:w="90"/>
+            </w:tcMar>
+          </w:tcPr>
+          <w:p>
+            <w:pPr>
+              <w:spacing w:after="0" w:line="260"/>
+            </w:pPr>
+            <w:r>
+              <w:rPr>
+                <w:b w:val="false"/>
+                <w:bCs w:val="false"/>
+                <w:sz w:val="18"/>
+                <w:szCs w:val="18"/>
+              </w:rPr>
+              <w:t xml:space="preserve">2%</w:t>
+            </w:r>
+          </w:p>
+        </w:tc>
+        <w:tc>
+          <w:tcPr>
+            <w:tcW w:type="dxa" w:w="1302"/>
+            <w:tcBorders>
+              <w:top w:val="single" w:color="B9C8C4" w:sz="4"/>
+              <w:left w:val="single" w:color="B9C8C4" w:sz="4"/>
+              <w:bottom w:val="single" w:color="B9C8C4" w:sz="4"/>
+              <w:right w:val="single" w:color="B9C8C4" w:sz="4"/>
+            </w:tcBorders>
+            <w:tcMar>
+              <w:top w:type="dxa" w:w="60"/>
+              <w:left w:type="dxa" w:w="90"/>
+              <w:bottom w:type="dxa" w:w="60"/>
+              <w:right w:type="dxa" w:w="90"/>
+            </w:tcMar>
+          </w:tcPr>
+          <w:p>
+            <w:pPr>
+              <w:spacing w:after="0" w:line="260"/>
+            </w:pPr>
+            <w:r>
+              <w:rPr>
+                <w:b w:val="false"/>
+                <w:bCs w:val="false"/>
+                <w:sz w:val="18"/>
+                <w:szCs w:val="18"/>
+              </w:rPr>
+              <w:t xml:space="preserve">2%</w:t>
+            </w:r>
+          </w:p>
+        </w:tc>
+        <w:tc>
+          <w:tcPr>
+            <w:tcW w:type="dxa" w:w="1302"/>
+            <w:tcBorders>
+              <w:top w:val="single" w:color="B9C8C4" w:sz="4"/>
+              <w:left w:val="single" w:color="B9C8C4" w:sz="4"/>
+              <w:bottom w:val="single" w:color="B9C8C4" w:sz="4"/>
+              <w:right w:val="single" w:color="B9C8C4" w:sz="4"/>
+            </w:tcBorders>
+            <w:tcMar>
+              <w:top w:type="dxa" w:w="60"/>
+              <w:left w:type="dxa" w:w="90"/>
+              <w:bottom w:type="dxa" w:w="60"/>
+              <w:right w:type="dxa" w:w="90"/>
+            </w:tcMar>
+          </w:tcPr>
+          <w:p>
+            <w:pPr>
+              <w:spacing w:after="0" w:line="260"/>
+            </w:pPr>
+            <w:r>
+              <w:rPr>
+                <w:b w:val="false"/>
+                <w:bCs w:val="false"/>
+                <w:sz w:val="18"/>
+                <w:szCs w:val="18"/>
+              </w:rPr>
+              <w:t xml:space="preserve">3%</w:t>
+            </w:r>
+          </w:p>
+        </w:tc>
+        <w:tc>
+          <w:tcPr>
+            <w:tcW w:type="dxa" w:w="1302"/>
+            <w:tcBorders>
+              <w:top w:val="single" w:color="B9C8C4" w:sz="4"/>
+              <w:left w:val="single" w:color="B9C8C4" w:sz="4"/>
+              <w:bottom w:val="single" w:color="B9C8C4" w:sz="4"/>
+              <w:right w:val="single" w:color="B9C8C4" w:sz="4"/>
+            </w:tcBorders>
+            <w:tcMar>
+              <w:top w:type="dxa" w:w="60"/>
+              <w:left w:type="dxa" w:w="90"/>
+              <w:bottom w:type="dxa" w:w="60"/>
+              <w:right w:type="dxa" w:w="90"/>
+            </w:tcMar>
+          </w:tcPr>
+          <w:p>
+            <w:pPr>
+              <w:spacing w:after="0" w:line="260"/>
+            </w:pPr>
+            <w:r>
+              <w:rPr>
+                <w:b w:val="false"/>
+                <w:bCs w:val="false"/>
+                <w:sz w:val="18"/>
+                <w:szCs w:val="18"/>
+              </w:rPr>
+              <w:t xml:space="preserve">9%</w:t>
+            </w:r>
+          </w:p>
+        </w:tc>
+        <w:tc>
+          <w:tcPr>
+            <w:tcW w:type="dxa" w:w="1304"/>
+            <w:tcBorders>
+              <w:top w:val="single" w:color="B9C8C4" w:sz="4"/>
+              <w:left w:val="single" w:color="B9C8C4" w:sz="4"/>
+              <w:bottom w:val="single" w:color="B9C8C4" w:sz="4"/>
+              <w:right w:val="single" w:color="B9C8C4" w:sz="4"/>
+            </w:tcBorders>
+            <w:tcMar>
+              <w:top w:type="dxa" w:w="60"/>
+              <w:left w:type="dxa" w:w="90"/>
+              <w:bottom w:type="dxa" w:w="60"/>
+              <w:right w:type="dxa" w:w="90"/>
+            </w:tcMar>
+          </w:tcPr>
+          <w:p>
+            <w:pPr>
+              <w:spacing w:after="0" w:line="260"/>
+            </w:pPr>
+            <w:r>
+              <w:rPr>
+                <w:b w:val="false"/>
+                <w:bCs w:val="false"/>
+                <w:sz w:val="18"/>
+                <w:szCs w:val="18"/>
+              </w:rPr>
+              <w:t xml:space="preserve">4%</w:t>
+            </w:r>
+          </w:p>
+        </w:tc>
+      </w:tr>
+      <w:tr>
+        <w:tc>
+          <w:tcPr>
+            <w:tcW w:type="dxa" w:w="3126"/>
+            <w:tcBorders>
+              <w:top w:val="single" w:color="B9C8C4" w:sz="4"/>
+              <w:left w:val="single" w:color="B9C8C4" w:sz="4"/>
+              <w:bottom w:val="single" w:color="B9C8C4" w:sz="4"/>
+              <w:right w:val="single" w:color="B9C8C4" w:sz="4"/>
+            </w:tcBorders>
+            <w:tcMar>
+              <w:top w:type="dxa" w:w="60"/>
+              <w:left w:type="dxa" w:w="90"/>
+              <w:bottom w:type="dxa" w:w="60"/>
+              <w:right w:type="dxa" w:w="90"/>
+            </w:tcMar>
+          </w:tcPr>
+          <w:p>
+            <w:pPr>
+              <w:spacing w:after="0" w:line="260"/>
+            </w:pPr>
+            <w:r>
+              <w:rPr>
+                <w:b w:val="false"/>
+                <w:bCs w:val="false"/>
+                <w:sz w:val="18"/>
+                <w:szCs w:val="18"/>
+              </w:rPr>
+              <w:t xml:space="preserve">용혈</w:t>
+            </w:r>
+          </w:p>
+        </w:tc>
+        <w:tc>
+          <w:tcPr>
+            <w:tcW w:type="dxa" w:w="1302"/>
+            <w:tcBorders>
+              <w:top w:val="single" w:color="B9C8C4" w:sz="4"/>
+              <w:left w:val="single" w:color="B9C8C4" w:sz="4"/>
+              <w:bottom w:val="single" w:color="B9C8C4" w:sz="4"/>
+              <w:right w:val="single" w:color="B9C8C4" w:sz="4"/>
+            </w:tcBorders>
+            <w:tcMar>
+              <w:top w:type="dxa" w:w="60"/>
+              <w:left w:type="dxa" w:w="90"/>
+              <w:bottom w:type="dxa" w:w="60"/>
+              <w:right w:type="dxa" w:w="90"/>
+            </w:tcMar>
+          </w:tcPr>
+          <w:p>
+            <w:pPr>
+              <w:spacing w:after="0" w:line="260"/>
+            </w:pPr>
+            <w:r>
+              <w:rPr>
+                <w:b w:val="false"/>
+                <w:bCs w:val="false"/>
+                <w:sz w:val="18"/>
+                <w:szCs w:val="18"/>
+              </w:rPr>
+              <w:t xml:space="preserve">1%</w:t>
+            </w:r>
+          </w:p>
+        </w:tc>
+        <w:tc>
+          <w:tcPr>
+            <w:tcW w:type="dxa" w:w="1302"/>
+            <w:tcBorders>
+              <w:top w:val="single" w:color="B9C8C4" w:sz="4"/>
+              <w:left w:val="single" w:color="B9C8C4" w:sz="4"/>
+              <w:bottom w:val="single" w:color="B9C8C4" w:sz="4"/>
+              <w:right w:val="single" w:color="B9C8C4" w:sz="4"/>
+            </w:tcBorders>
+            <w:tcMar>
+              <w:top w:type="dxa" w:w="60"/>
+              <w:left w:type="dxa" w:w="90"/>
+              <w:bottom w:type="dxa" w:w="60"/>
+              <w:right w:type="dxa" w:w="90"/>
+            </w:tcMar>
+          </w:tcPr>
+          <w:p>
+            <w:pPr>
+              <w:spacing w:after="0" w:line="260"/>
+            </w:pPr>
+            <w:r>
+              <w:rPr>
+                <w:b w:val="false"/>
+                <w:bCs w:val="false"/>
+                <w:sz w:val="18"/>
+                <w:szCs w:val="18"/>
+              </w:rPr>
+              <w:t xml:space="preserve">1%</w:t>
+            </w:r>
+          </w:p>
+        </w:tc>
+        <w:tc>
+          <w:tcPr>
+            <w:tcW w:type="dxa" w:w="1302"/>
+            <w:tcBorders>
+              <w:top w:val="single" w:color="B9C8C4" w:sz="4"/>
+              <w:left w:val="single" w:color="B9C8C4" w:sz="4"/>
+              <w:bottom w:val="single" w:color="B9C8C4" w:sz="4"/>
+              <w:right w:val="single" w:color="B9C8C4" w:sz="4"/>
+            </w:tcBorders>
+            <w:tcMar>
+              <w:top w:type="dxa" w:w="60"/>
+              <w:left w:type="dxa" w:w="90"/>
+              <w:bottom w:type="dxa" w:w="60"/>
+              <w:right w:type="dxa" w:w="90"/>
+            </w:tcMar>
+          </w:tcPr>
+          <w:p>
+            <w:pPr>
+              <w:spacing w:after="0" w:line="260"/>
+            </w:pPr>
+            <w:r>
+              <w:rPr>
+                <w:b w:val="false"/>
+                <w:bCs w:val="false"/>
+                <w:sz w:val="18"/>
+                <w:szCs w:val="18"/>
+              </w:rPr>
+              <w:t xml:space="preserve">&lt;10</w:t>
+            </w:r>
+          </w:p>
+        </w:tc>
+        <w:tc>
+          <w:tcPr>
+            <w:tcW w:type="dxa" w:w="1302"/>
+            <w:tcBorders>
+              <w:top w:val="single" w:color="B9C8C4" w:sz="4"/>
+              <w:left w:val="single" w:color="B9C8C4" w:sz="4"/>
+              <w:bottom w:val="single" w:color="B9C8C4" w:sz="4"/>
+              <w:right w:val="single" w:color="B9C8C4" w:sz="4"/>
+            </w:tcBorders>
+            <w:tcMar>
+              <w:top w:type="dxa" w:w="60"/>
+              <w:left w:type="dxa" w:w="90"/>
+              <w:bottom w:type="dxa" w:w="60"/>
+              <w:right w:type="dxa" w:w="90"/>
+            </w:tcMar>
+          </w:tcPr>
+          <w:p>
+            <w:pPr>
+              <w:spacing w:after="0" w:line="260"/>
+            </w:pPr>
+            <w:r>
+              <w:rPr>
+                <w:b w:val="false"/>
+                <w:bCs w:val="false"/>
+                <w:sz w:val="18"/>
+                <w:szCs w:val="18"/>
+              </w:rPr>
+              <w:t xml:space="preserve">3%</w:t>
+            </w:r>
+          </w:p>
+        </w:tc>
+        <w:tc>
+          <w:tcPr>
+            <w:tcW w:type="dxa" w:w="1304"/>
+            <w:tcBorders>
+              <w:top w:val="single" w:color="B9C8C4" w:sz="4"/>
+              <w:left w:val="single" w:color="B9C8C4" w:sz="4"/>
+              <w:bottom w:val="single" w:color="B9C8C4" w:sz="4"/>
+              <w:right w:val="single" w:color="B9C8C4" w:sz="4"/>
+            </w:tcBorders>
+            <w:tcMar>
+              <w:top w:type="dxa" w:w="60"/>
+              <w:left w:type="dxa" w:w="90"/>
+              <w:bottom w:type="dxa" w:w="60"/>
+              <w:right w:type="dxa" w:w="90"/>
+            </w:tcMar>
+          </w:tcPr>
+          <w:p>
+            <w:pPr>
+              <w:spacing w:after="0" w:line="260"/>
+            </w:pPr>
+            <w:r>
+              <w:rPr>
+                <w:b w:val="false"/>
+                <w:bCs w:val="false"/>
+                <w:sz w:val="18"/>
+                <w:szCs w:val="18"/>
+              </w:rPr>
+              <w:t xml:space="preserve">4%</w:t>
+            </w:r>
+          </w:p>
+        </w:tc>
+      </w:tr>
+      <w:tr>
+        <w:tc>
+          <w:tcPr>
+            <w:tcW w:type="dxa" w:w="3126"/>
+            <w:tcBorders>
+              <w:top w:val="single" w:color="B9C8C4" w:sz="4"/>
+              <w:left w:val="single" w:color="B9C8C4" w:sz="4"/>
+              <w:bottom w:val="single" w:color="B9C8C4" w:sz="4"/>
+              <w:right w:val="single" w:color="B9C8C4" w:sz="4"/>
+            </w:tcBorders>
+            <w:tcMar>
+              <w:top w:type="dxa" w:w="60"/>
+              <w:left w:type="dxa" w:w="90"/>
+              <w:bottom w:type="dxa" w:w="60"/>
+              <w:right w:type="dxa" w:w="90"/>
+            </w:tcMar>
+          </w:tcPr>
+          <w:p>
+            <w:pPr>
+              <w:spacing w:after="0" w:line="260"/>
+            </w:pPr>
+            <w:r>
+              <w:rPr>
+                <w:b w:val="false"/>
+                <w:bCs w:val="false"/>
+                <w:sz w:val="18"/>
+                <w:szCs w:val="18"/>
+              </w:rPr>
+              <w:t xml:space="preserve">바이러스 간염</w:t>
+            </w:r>
+          </w:p>
+        </w:tc>
+        <w:tc>
+          <w:tcPr>
+            <w:tcW w:type="dxa" w:w="1302"/>
+            <w:tcBorders>
+              <w:top w:val="single" w:color="B9C8C4" w:sz="4"/>
+              <w:left w:val="single" w:color="B9C8C4" w:sz="4"/>
+              <w:bottom w:val="single" w:color="B9C8C4" w:sz="4"/>
+              <w:right w:val="single" w:color="B9C8C4" w:sz="4"/>
+            </w:tcBorders>
+            <w:tcMar>
+              <w:top w:type="dxa" w:w="60"/>
+              <w:left w:type="dxa" w:w="90"/>
+              <w:bottom w:type="dxa" w:w="60"/>
+              <w:right w:type="dxa" w:w="90"/>
+            </w:tcMar>
+          </w:tcPr>
+          <w:p>
+            <w:pPr>
+              <w:spacing w:after="0" w:line="260"/>
+            </w:pPr>
+            <w:r>
+              <w:rPr>
+                <w:b w:val="false"/>
+                <w:bCs w:val="false"/>
+                <w:sz w:val="18"/>
+                <w:szCs w:val="18"/>
+              </w:rPr>
+              <w:t xml:space="preserve">9%</w:t>
+            </w:r>
+          </w:p>
+        </w:tc>
+        <w:tc>
+          <w:tcPr>
+            <w:tcW w:type="dxa" w:w="1302"/>
+            <w:tcBorders>
+              <w:top w:val="single" w:color="B9C8C4" w:sz="4"/>
+              <w:left w:val="single" w:color="B9C8C4" w:sz="4"/>
+              <w:bottom w:val="single" w:color="B9C8C4" w:sz="4"/>
+              <w:right w:val="single" w:color="B9C8C4" w:sz="4"/>
+            </w:tcBorders>
+            <w:tcMar>
+              <w:top w:type="dxa" w:w="60"/>
+              <w:left w:type="dxa" w:w="90"/>
+              <w:bottom w:type="dxa" w:w="60"/>
+              <w:right w:type="dxa" w:w="90"/>
+            </w:tcMar>
+          </w:tcPr>
+          <w:p>
+            <w:pPr>
+              <w:spacing w:after="0" w:line="260"/>
+            </w:pPr>
+            <w:r>
+              <w:rPr>
+                <w:b w:val="false"/>
+                <w:bCs w:val="false"/>
+                <w:sz w:val="18"/>
+                <w:szCs w:val="18"/>
+              </w:rPr>
+              <w:t xml:space="preserve">7%</w:t>
+            </w:r>
+          </w:p>
+        </w:tc>
+        <w:tc>
+          <w:tcPr>
+            <w:tcW w:type="dxa" w:w="1302"/>
+            <w:tcBorders>
+              <w:top w:val="single" w:color="B9C8C4" w:sz="4"/>
+              <w:left w:val="single" w:color="B9C8C4" w:sz="4"/>
+              <w:bottom w:val="single" w:color="B9C8C4" w:sz="4"/>
+              <w:right w:val="single" w:color="B9C8C4" w:sz="4"/>
+            </w:tcBorders>
+            <w:tcMar>
+              <w:top w:type="dxa" w:w="60"/>
+              <w:left w:type="dxa" w:w="90"/>
+              <w:bottom w:type="dxa" w:w="60"/>
+              <w:right w:type="dxa" w:w="90"/>
+            </w:tcMar>
+          </w:tcPr>
+          <w:p>
+            <w:pPr>
+              <w:spacing w:after="0" w:line="260"/>
+            </w:pPr>
+            <w:r>
+              <w:rPr>
+                <w:b w:val="false"/>
+                <w:bCs w:val="false"/>
+                <w:sz w:val="18"/>
+                <w:szCs w:val="18"/>
+              </w:rPr>
+              <w:t xml:space="preserve">3%</w:t>
+            </w:r>
+          </w:p>
+        </w:tc>
+        <w:tc>
+          <w:tcPr>
+            <w:tcW w:type="dxa" w:w="1302"/>
+            <w:tcBorders>
+              <w:top w:val="single" w:color="B9C8C4" w:sz="4"/>
+              <w:left w:val="single" w:color="B9C8C4" w:sz="4"/>
+              <w:bottom w:val="single" w:color="B9C8C4" w:sz="4"/>
+              <w:right w:val="single" w:color="B9C8C4" w:sz="4"/>
+            </w:tcBorders>
+            <w:tcMar>
+              <w:top w:type="dxa" w:w="60"/>
+              <w:left w:type="dxa" w:w="90"/>
+              <w:bottom w:type="dxa" w:w="60"/>
+              <w:right w:type="dxa" w:w="90"/>
+            </w:tcMar>
+          </w:tcPr>
+          <w:p>
+            <w:pPr>
+              <w:spacing w:after="0" w:line="260"/>
+            </w:pPr>
+            <w:r>
+              <w:rPr>
+                <w:b w:val="false"/>
+                <w:bCs w:val="false"/>
+                <w:sz w:val="18"/>
+                <w:szCs w:val="18"/>
+              </w:rPr>
+              <w:t xml:space="preserve">12%</w:t>
+            </w:r>
+          </w:p>
+        </w:tc>
+        <w:tc>
+          <w:tcPr>
+            <w:tcW w:type="dxa" w:w="1304"/>
+            <w:tcBorders>
+              <w:top w:val="single" w:color="B9C8C4" w:sz="4"/>
+              <w:left w:val="single" w:color="B9C8C4" w:sz="4"/>
+              <w:bottom w:val="single" w:color="B9C8C4" w:sz="4"/>
+              <w:right w:val="single" w:color="B9C8C4" w:sz="4"/>
+            </w:tcBorders>
+            <w:tcMar>
+              <w:top w:type="dxa" w:w="60"/>
+              <w:left w:type="dxa" w:w="90"/>
+              <w:bottom w:type="dxa" w:w="60"/>
+              <w:right w:type="dxa" w:w="90"/>
+            </w:tcMar>
+          </w:tcPr>
+          <w:p>
+            <w:pPr>
+              <w:spacing w:after="0" w:line="260"/>
+            </w:pPr>
+            <w:r>
+              <w:rPr>
+                <w:b w:val="false"/>
+                <w:bCs w:val="false"/>
+                <w:sz w:val="18"/>
+                <w:szCs w:val="18"/>
+              </w:rPr>
+              <w:t xml:space="preserve">16%</w:t>
+            </w:r>
+          </w:p>
+        </w:tc>
+      </w:tr>
+      <w:tr>
+        <w:tc>
+          <w:tcPr>
+            <w:tcW w:type="dxa" w:w="3126"/>
+            <w:tcBorders>
+              <w:top w:val="single" w:color="B9C8C4" w:sz="4"/>
+              <w:left w:val="single" w:color="B9C8C4" w:sz="4"/>
+              <w:bottom w:val="single" w:color="B9C8C4" w:sz="4"/>
+              <w:right w:val="single" w:color="B9C8C4" w:sz="4"/>
+            </w:tcBorders>
+            <w:tcMar>
+              <w:top w:type="dxa" w:w="60"/>
+              <w:left w:type="dxa" w:w="90"/>
+              <w:bottom w:type="dxa" w:w="60"/>
+              <w:right w:type="dxa" w:w="90"/>
+            </w:tcMar>
+          </w:tcPr>
+          <w:p>
+            <w:pPr>
+              <w:spacing w:after="0" w:line="260"/>
+            </w:pPr>
+            <w:r>
+              <w:rPr>
+                <w:b w:val="false"/>
+                <w:bCs w:val="false"/>
+                <w:sz w:val="18"/>
+                <w:szCs w:val="18"/>
+              </w:rPr>
+              <w:t xml:space="preserve">기타</w:t>
+            </w:r>
+          </w:p>
+        </w:tc>
+        <w:tc>
+          <w:tcPr>
+            <w:tcW w:type="dxa" w:w="1302"/>
+            <w:tcBorders>
+              <w:top w:val="single" w:color="B9C8C4" w:sz="4"/>
+              <w:left w:val="single" w:color="B9C8C4" w:sz="4"/>
+              <w:bottom w:val="single" w:color="B9C8C4" w:sz="4"/>
+              <w:right w:val="single" w:color="B9C8C4" w:sz="4"/>
+            </w:tcBorders>
+            <w:tcMar>
+              <w:top w:type="dxa" w:w="60"/>
+              <w:left w:type="dxa" w:w="90"/>
+              <w:bottom w:type="dxa" w:w="60"/>
+              <w:right w:type="dxa" w:w="90"/>
+            </w:tcMar>
+          </w:tcPr>
+          <w:p>
+            <w:pPr>
+              <w:spacing w:after="0" w:line="260"/>
+            </w:pPr>
+            <w:r>
+              <w:rPr>
+                <w:b w:val="false"/>
+                <w:bCs w:val="false"/>
+                <w:sz w:val="18"/>
+                <w:szCs w:val="18"/>
+              </w:rPr>
+              <w:t xml:space="preserve">21%</w:t>
+            </w:r>
+          </w:p>
+        </w:tc>
+        <w:tc>
+          <w:tcPr>
+            <w:tcW w:type="dxa" w:w="1302"/>
+            <w:tcBorders>
+              <w:top w:val="single" w:color="B9C8C4" w:sz="4"/>
+              <w:left w:val="single" w:color="B9C8C4" w:sz="4"/>
+              <w:bottom w:val="single" w:color="B9C8C4" w:sz="4"/>
+              <w:right w:val="single" w:color="B9C8C4" w:sz="4"/>
+            </w:tcBorders>
+            <w:tcMar>
+              <w:top w:type="dxa" w:w="60"/>
+              <w:left w:type="dxa" w:w="90"/>
+              <w:bottom w:type="dxa" w:w="60"/>
+              <w:right w:type="dxa" w:w="90"/>
+            </w:tcMar>
+          </w:tcPr>
+          <w:p>
+            <w:pPr>
+              <w:spacing w:after="0" w:line="260"/>
+            </w:pPr>
+            <w:r>
+              <w:rPr>
+                <w:b w:val="false"/>
+                <w:bCs w:val="false"/>
+                <w:sz w:val="18"/>
+                <w:szCs w:val="18"/>
+              </w:rPr>
+              <w:t xml:space="preserve">17%</w:t>
+            </w:r>
+          </w:p>
+        </w:tc>
+        <w:tc>
+          <w:tcPr>
+            <w:tcW w:type="dxa" w:w="1302"/>
+            <w:tcBorders>
+              <w:top w:val="single" w:color="B9C8C4" w:sz="4"/>
+              <w:left w:val="single" w:color="B9C8C4" w:sz="4"/>
+              <w:bottom w:val="single" w:color="B9C8C4" w:sz="4"/>
+              <w:right w:val="single" w:color="B9C8C4" w:sz="4"/>
+            </w:tcBorders>
+            <w:tcMar>
+              <w:top w:type="dxa" w:w="60"/>
+              <w:left w:type="dxa" w:w="90"/>
+              <w:bottom w:type="dxa" w:w="60"/>
+              <w:right w:type="dxa" w:w="90"/>
+            </w:tcMar>
+          </w:tcPr>
+          <w:p>
+            <w:pPr>
+              <w:spacing w:after="0" w:line="260"/>
+            </w:pPr>
+            <w:r>
+              <w:rPr>
+                <w:b w:val="false"/>
+                <w:bCs w:val="false"/>
+                <w:sz w:val="18"/>
+                <w:szCs w:val="18"/>
+              </w:rPr>
+              <w:t xml:space="preserve">13%</w:t>
+            </w:r>
+          </w:p>
+        </w:tc>
+        <w:tc>
+          <w:tcPr>
+            <w:tcW w:type="dxa" w:w="1302"/>
+            <w:tcBorders>
+              <w:top w:val="single" w:color="B9C8C4" w:sz="4"/>
+              <w:left w:val="single" w:color="B9C8C4" w:sz="4"/>
+              <w:bottom w:val="single" w:color="B9C8C4" w:sz="4"/>
+              <w:right w:val="single" w:color="B9C8C4" w:sz="4"/>
+            </w:tcBorders>
+            <w:tcMar>
+              <w:top w:type="dxa" w:w="60"/>
+              <w:left w:type="dxa" w:w="90"/>
+              <w:bottom w:type="dxa" w:w="60"/>
+              <w:right w:type="dxa" w:w="90"/>
+            </w:tcMar>
+          </w:tcPr>
+          <w:p>
+            <w:pPr>
+              <w:spacing w:after="0" w:line="260"/>
+            </w:pPr>
+            <w:r>
+              <w:rPr>
+                <w:b w:val="false"/>
+                <w:bCs w:val="false"/>
+                <w:sz w:val="18"/>
+                <w:szCs w:val="18"/>
+              </w:rPr>
+              <w:t xml:space="preserve">44%</w:t>
+            </w:r>
+          </w:p>
+        </w:tc>
+        <w:tc>
+          <w:tcPr>
+            <w:tcW w:type="dxa" w:w="1304"/>
+            <w:tcBorders>
+              <w:top w:val="single" w:color="B9C8C4" w:sz="4"/>
+              <w:left w:val="single" w:color="B9C8C4" w:sz="4"/>
+              <w:bottom w:val="single" w:color="B9C8C4" w:sz="4"/>
+              <w:right w:val="single" w:color="B9C8C4" w:sz="4"/>
+            </w:tcBorders>
+            <w:tcMar>
+              <w:top w:type="dxa" w:w="60"/>
+              <w:left w:type="dxa" w:w="90"/>
+              <w:bottom w:type="dxa" w:w="60"/>
+              <w:right w:type="dxa" w:w="90"/>
+            </w:tcMar>
+          </w:tcPr>
+          <w:p>
+            <w:pPr>
+              <w:spacing w:after="0" w:line="260"/>
+            </w:pPr>
+            <w:r>
+              <w:rPr>
+                <w:b w:val="false"/>
+                <w:bCs w:val="false"/>
+                <w:sz w:val="18"/>
+                <w:szCs w:val="18"/>
+              </w:rPr>
+              <w:t xml:space="preserve">50%</w:t>
+            </w:r>
+          </w:p>
+        </w:tc>
+      </w:tr>
+    </w:tbl>
+    <w:p>
+      <w:pPr>
+        <w:pStyle w:val="Heading2"/>
+      </w:pPr>
+      <w:r>
+        <w:t xml:space="preserve">판단</w:t>
+      </w:r>
+    </w:p>
+    <w:p>
+      <w:pPr>
+        <w:pStyle w:val="ListParagraph"/>
+        <w:numPr>
+          <w:ilvl w:val="0"/>
+          <w:numId w:val="2"/>
+        </w:numPr>
+        <w:spacing w:after="60" w:line="290"/>
+      </w:pPr>
+      <w:r>
+        <w:rPr>
+          <w:b/>
+          <w:bCs/>
+        </w:rPr>
+        <w:t xml:space="preserve">군집과 진단 코드는 의미 있게 맞물립니다. </w:t>
+      </w:r>
+      <w:r>
+        <w:t xml:space="preserve">C0(허혈성 간세포형)은 저산소성 간염 코드 59%로 가장 높고 심부전 코드도 34%로 가장 높습니다. C3(황달 동반 혼합형)은 담도폐쇄·담관염 코드가 30%로 다른 군집(3-8%)의 4-10배이고 담낭염도 9%로 가장 높습니다. C4(기저 간질환형)는 바이러스 간염 16%, 기타(간경변·알코올) 50%로 만성 간질환이 모입니다. C2(순수 담즙정체형)는 패혈증 코드 44%입니다. C1(경도 혼합형)은 특정 원인이 두드러지지 않습니다.</w:t>
+      </w:r>
+    </w:p>
+    <w:p>
+      <w:pPr>
+        <w:pStyle w:val="ListParagraph"/>
+        <w:numPr>
+          <w:ilvl w:val="0"/>
+          <w:numId w:val="2"/>
+        </w:numPr>
+        <w:spacing w:after="60" w:line="290"/>
+      </w:pPr>
+      <w:r>
+        <w:rPr>
+          <w:b/>
+          <w:bCs/>
+        </w:rPr>
+        <w:t xml:space="preserve">규칙 판정은 군집과 지나치게 잘 맞습니다. </w:t>
+      </w:r>
+      <w:r>
+        <w:t xml:space="preserve">저산소성 간염 95%(C0), 패혈증 담즙정체 71-84%(C2-C4)는 규칙이 군집과 같은 간 수치 모양을 보고 판정하기 때문입니다. 이것은 원인을 맞혔다는 근거가 아니라 같은 정보를 두 번 본 결과입니다.</w:t>
+      </w:r>
+    </w:p>
+    <w:p>
+      <w:pPr>
+        <w:pStyle w:val="ListParagraph"/>
+        <w:numPr>
+          <w:ilvl w:val="0"/>
+          <w:numId w:val="2"/>
+        </w:numPr>
+        <w:spacing w:after="60" w:line="290"/>
+      </w:pPr>
+      <w:r>
+        <w:rPr>
+          <w:b/>
+          <w:bCs/>
+        </w:rPr>
+        <w:t xml:space="preserve">규칙의 담도폐쇄 판정은 쓸모가 없습니다. </w:t>
+      </w:r>
+      <w:r>
+        <w:t xml:space="preserve">모든 군집에서 63-73%로 거의 같아 군집을 구분하지 못합니다. 진단 코드로는 C3에만 몰려 있으므로, 규칙의 담도 기준(빌리루빈·백혈구 중심)을 영상·담관 확장 정보가 없을 때는 낮춰야 합니다. 이전에 확인한 특이도 32%와 같은 문제입니다.</w:t>
+      </w:r>
+    </w:p>
+    <w:p>
+      <w:pPr>
+        <w:pStyle w:val="ListParagraph"/>
+        <w:numPr>
+          <w:ilvl w:val="0"/>
+          <w:numId w:val="2"/>
+        </w:numPr>
+        <w:spacing w:after="60" w:line="290"/>
+      </w:pPr>
+      <w:r>
+        <w:rPr>
+          <w:b/>
+          <w:bCs/>
+        </w:rPr>
+        <w:t xml:space="preserve">규칙이 놓치는 것. </w:t>
+      </w:r>
+      <w:r>
+        <w:t xml:space="preserve">C4에서 진단 코드상 만성 간질환(기타 50%, 바이러스 16%)이 많지만 규칙 판정은 기타 22%, 바이러스 0%입니다. 규칙은 이전 입원 진단과 혈청 검사가 있을 때만 이를 잡습니다.</w:t>
+      </w:r>
+    </w:p>
+    <w:p>
+      <w:pPr>
+        <w:pStyle w:val="ListParagraph"/>
+        <w:numPr>
+          <w:ilvl w:val="0"/>
+          <w:numId w:val="2"/>
+        </w:numPr>
+        <w:spacing w:after="60" w:line="290"/>
+      </w:pPr>
+      <w:r>
+        <w:rPr>
+          <w:b/>
+          <w:bCs/>
+        </w:rPr>
+        <w:t xml:space="preserve">해석의 한계. </w:t>
+      </w:r>
+      <w:r>
+        <w:t xml:space="preserve">퇴원 진단 코드는 시각이 없고 입원 단위라 ICU 전후에 생긴 문제와 기저질환이 섞입니다. 쇼크 코드를 저산소성 간염, 심부전 코드를 울혈성 간병증으로 넓게 잡아서 비율이 실제보다 높습니다. 정맥영양은 코드가 없어 0%, 담낭염 규칙 판정은 설계상 판단하지 않아 0%입니다.</w:t>
+      </w:r>
+    </w:p>
+    <w:p>
+      <w:pPr>
+        <w:pStyle w:val="Heading1"/>
+        <w:spacing w:after="200" w:before="360"/>
+      </w:pPr>
+      <w:r>
+        <w:t xml:space="preserve">7. 군집이 예후 정보를 더하는가</w:t>
+      </w:r>
+    </w:p>
+    <w:p>
+      <w:pPr>
+        <w:spacing w:after="60" w:before="120"/>
+        <w:jc w:val="center"/>
+      </w:pPr>
+      <w:r>
+        <w:drawing>
+          <wp:inline distT="0" distB="0" distL="0" distR="0">
+            <wp:extent cx="4324350" cy="2933700"/>
+            <wp:effectExtent t="0" r="0" b="0" l="0"/>
+            <wp:docPr id="1" name="" descr="" title=""/>
+            <wp:cNvGraphicFramePr>
+              <a:graphicFrameLocks xmlns:a="http://schemas.openxmlformats.org/drawingml/2006/main" noChangeAspect="1"/>
+            </wp:cNvGraphicFramePr>
+            <a:graphic xmlns:a="http://schemas.openxmlformats.org/drawingml/2006/main">
+              <a:graphicData uri="http://schemas.openxmlformats.org/drawingml/2006/picture">
+                <pic:pic xmlns:pic="http://schemas.openxmlformats.org/drawingml/2006/picture">
+                  <pic:nvPicPr>
+                    <pic:cNvPr id="0" name="" descr=""/>
+                    <pic:cNvPicPr>
+                      <a:picLocks noChangeAspect="1" noChangeArrowheads="1"/>
+                    </pic:cNvPicPr>
+                  </pic:nvPicPr>
+                  <pic:blipFill>
+                    <a:blip r:embed="rId14" cstate="none"/>
+                    <a:srcRect/>
+                    <a:stretch>
+                      <a:fillRect/>
+                    </a:stretch>
+                  </pic:blipFill>
+                  <pic:spPr bwMode="auto">
+                    <a:xfrm>
+                      <a:off x="0" y="0"/>
+                      <a:ext cx="4324350" cy="2933700"/>
                     </a:xfrm>
                     <a:prstGeom prst="rect">
                       <a:avLst/>
@@ -10582,7 +14991,7 @@
         <w:spacing w:after="200" w:before="360"/>
       </w:pPr>
       <w:r>
-        <w:t xml:space="preserve">7. 한계와 다음 단계</w:t>
+        <w:t xml:space="preserve">8. 한계와 다음 단계</w:t>
       </w:r>
     </w:p>
     <w:p>
@@ -10595,7 +15004,7 @@
         <w:spacing w:after="60" w:line="290"/>
       </w:pPr>
       <w:r>
-        <w:t xml:space="preserve">군집은 원인 진단이 아닙니다. 규칙 원인 판정(Agent 1)과 군집의 연결은 이번 실행에 원인 판정 기록이 붙지 않아 확인하지 못했습니다.</w:t>
+        <w:t xml:space="preserve">군집은 원인 진단이 아닙니다. 진단 코드와의 연결은 시각 없는 대리 기준이므로 전문의 판정으로 확인해야 합니다.</w:t>
       </w:r>
     </w:p>
     <w:p>

</xml_diff>